<commit_message>
Código da API customizada
</commit_message>
<xml_diff>
--- a/Documentação/Documentação do Projeto/PROJETO COGUMELO.docx
+++ b/Documentação/Documentação do Projeto/PROJETO COGUMELO.docx
@@ -3982,6 +3982,2020 @@
     <w:p/>
     <w:p/>
     <w:p/>
+    <w:p>
+      <w:r>
+        <w:t xml:space="preserve">// importa </w:t>
+      </w:r>
+      <w:proofErr w:type="gramStart"/>
+      <w:r>
+        <w:t>os bibliotecas</w:t>
+      </w:r>
+      <w:proofErr w:type="gramEnd"/>
+      <w:r>
+        <w:t xml:space="preserve"> necessários</w:t>
+      </w:r>
+    </w:p>
+    <w:p>
+      <w:proofErr w:type="spellStart"/>
+      <w:r>
+        <w:rPr>
+          <w:i/>
+          <w:iCs/>
+        </w:rPr>
+        <w:t>const</w:t>
+      </w:r>
+      <w:proofErr w:type="spellEnd"/>
+      <w:r>
+        <w:t xml:space="preserve"> </w:t>
+      </w:r>
+      <w:proofErr w:type="spellStart"/>
+      <w:r>
+        <w:t>serialport</w:t>
+      </w:r>
+      <w:proofErr w:type="spellEnd"/>
+      <w:r>
+        <w:t xml:space="preserve"> = require('</w:t>
+      </w:r>
+      <w:proofErr w:type="spellStart"/>
+      <w:r>
+        <w:t>serialport</w:t>
+      </w:r>
+      <w:proofErr w:type="spellEnd"/>
+      <w:r>
+        <w:t>');</w:t>
+      </w:r>
+    </w:p>
+    <w:p>
+      <w:proofErr w:type="spellStart"/>
+      <w:r>
+        <w:rPr>
+          <w:i/>
+          <w:iCs/>
+        </w:rPr>
+        <w:t>const</w:t>
+      </w:r>
+      <w:proofErr w:type="spellEnd"/>
+      <w:r>
+        <w:t xml:space="preserve"> </w:t>
+      </w:r>
+      <w:proofErr w:type="spellStart"/>
+      <w:r>
+        <w:t>express</w:t>
+      </w:r>
+      <w:proofErr w:type="spellEnd"/>
+      <w:r>
+        <w:t xml:space="preserve"> = require('</w:t>
+      </w:r>
+      <w:proofErr w:type="spellStart"/>
+      <w:r>
+        <w:t>express</w:t>
+      </w:r>
+      <w:proofErr w:type="spellEnd"/>
+      <w:r>
+        <w:t>');</w:t>
+      </w:r>
+    </w:p>
+    <w:p>
+      <w:proofErr w:type="spellStart"/>
+      <w:r>
+        <w:rPr>
+          <w:i/>
+          <w:iCs/>
+        </w:rPr>
+        <w:t>const</w:t>
+      </w:r>
+      <w:proofErr w:type="spellEnd"/>
+      <w:r>
+        <w:t xml:space="preserve"> </w:t>
+      </w:r>
+      <w:proofErr w:type="spellStart"/>
+      <w:r>
+        <w:t>mysql</w:t>
+      </w:r>
+      <w:proofErr w:type="spellEnd"/>
+      <w:r>
+        <w:t xml:space="preserve"> = require('mysql2');</w:t>
+      </w:r>
+    </w:p>
+    <w:p/>
+    <w:p>
+      <w:r>
+        <w:t>// constantes para configurações</w:t>
+      </w:r>
+    </w:p>
+    <w:p>
+      <w:proofErr w:type="spellStart"/>
+      <w:r>
+        <w:rPr>
+          <w:i/>
+          <w:iCs/>
+        </w:rPr>
+        <w:t>const</w:t>
+      </w:r>
+      <w:proofErr w:type="spellEnd"/>
+      <w:r>
+        <w:t xml:space="preserve"> SERIAL_BAUD_RATE = 9600;</w:t>
+      </w:r>
+    </w:p>
+    <w:p>
+      <w:proofErr w:type="spellStart"/>
+      <w:r>
+        <w:rPr>
+          <w:i/>
+          <w:iCs/>
+        </w:rPr>
+        <w:t>const</w:t>
+      </w:r>
+      <w:proofErr w:type="spellEnd"/>
+      <w:r>
+        <w:t xml:space="preserve"> SERVIDOR_PORTA = 3300;</w:t>
+      </w:r>
+    </w:p>
+    <w:p/>
+    <w:p>
+      <w:r>
+        <w:t>// habilita ou desabilita a inserção de dados no banco de dados</w:t>
+      </w:r>
+    </w:p>
+    <w:p>
+      <w:proofErr w:type="spellStart"/>
+      <w:r>
+        <w:rPr>
+          <w:i/>
+          <w:iCs/>
+        </w:rPr>
+        <w:t>const</w:t>
+      </w:r>
+      <w:proofErr w:type="spellEnd"/>
+      <w:r>
+        <w:t xml:space="preserve"> HABILITAR_OPERACAO_INSERIR = </w:t>
+      </w:r>
+      <w:proofErr w:type="spellStart"/>
+      <w:r>
+        <w:t>true</w:t>
+      </w:r>
+      <w:proofErr w:type="spellEnd"/>
+      <w:r>
+        <w:t>;</w:t>
+      </w:r>
+    </w:p>
+    <w:p/>
+    <w:p>
+      <w:r>
+        <w:t>// função para comunicação serial</w:t>
+      </w:r>
+    </w:p>
+    <w:p>
+      <w:proofErr w:type="spellStart"/>
+      <w:r>
+        <w:rPr>
+          <w:i/>
+          <w:iCs/>
+        </w:rPr>
+        <w:t>const</w:t>
+      </w:r>
+      <w:proofErr w:type="spellEnd"/>
+      <w:r>
+        <w:t xml:space="preserve"> serial = </w:t>
+      </w:r>
+      <w:proofErr w:type="spellStart"/>
+      <w:r>
+        <w:t>async</w:t>
+      </w:r>
+      <w:proofErr w:type="spellEnd"/>
+      <w:r>
+        <w:t xml:space="preserve"> (</w:t>
+      </w:r>
+    </w:p>
+    <w:p>
+      <w:r>
+        <w:t xml:space="preserve">    </w:t>
+      </w:r>
+      <w:proofErr w:type="spellStart"/>
+      <w:r>
+        <w:rPr>
+          <w:i/>
+          <w:iCs/>
+        </w:rPr>
+        <w:t>valoresSensorUmidade</w:t>
+      </w:r>
+      <w:proofErr w:type="spellEnd"/>
+      <w:r>
+        <w:t>,</w:t>
+      </w:r>
+    </w:p>
+    <w:p>
+      <w:r>
+        <w:t xml:space="preserve">    </w:t>
+      </w:r>
+      <w:proofErr w:type="spellStart"/>
+      <w:r>
+        <w:rPr>
+          <w:i/>
+          <w:iCs/>
+        </w:rPr>
+        <w:t>valoresSensorTemperatura</w:t>
+      </w:r>
+      <w:proofErr w:type="spellEnd"/>
+      <w:r>
+        <w:t>,</w:t>
+      </w:r>
+    </w:p>
+    <w:p>
+      <w:r>
+        <w:t xml:space="preserve">) </w:t>
+      </w:r>
+      <w:r>
+        <w:rPr>
+          <w:i/>
+          <w:iCs/>
+        </w:rPr>
+        <w:t>=&gt;</w:t>
+      </w:r>
+      <w:r>
+        <w:t xml:space="preserve"> {</w:t>
+      </w:r>
+    </w:p>
+    <w:p/>
+    <w:p>
+      <w:r>
+        <w:t>    // conexão com o banco de dados MySQL</w:t>
+      </w:r>
+    </w:p>
+    <w:p>
+      <w:r>
+        <w:t xml:space="preserve">    </w:t>
+      </w:r>
+      <w:proofErr w:type="spellStart"/>
+      <w:r>
+        <w:rPr>
+          <w:i/>
+          <w:iCs/>
+        </w:rPr>
+        <w:t>let</w:t>
+      </w:r>
+      <w:proofErr w:type="spellEnd"/>
+      <w:r>
+        <w:t xml:space="preserve"> </w:t>
+      </w:r>
+      <w:proofErr w:type="spellStart"/>
+      <w:r>
+        <w:t>poolBancoDados</w:t>
+      </w:r>
+      <w:proofErr w:type="spellEnd"/>
+      <w:r>
+        <w:t xml:space="preserve"> = </w:t>
+      </w:r>
+      <w:proofErr w:type="spellStart"/>
+      <w:proofErr w:type="gramStart"/>
+      <w:r>
+        <w:t>mysql.createPool</w:t>
+      </w:r>
+      <w:proofErr w:type="spellEnd"/>
+      <w:proofErr w:type="gramEnd"/>
+      <w:r>
+        <w:t>(</w:t>
+      </w:r>
+    </w:p>
+    <w:p>
+      <w:r>
+        <w:lastRenderedPageBreak/>
+        <w:t>        {</w:t>
+      </w:r>
+    </w:p>
+    <w:p>
+      <w:r>
+        <w:t>            host: '</w:t>
+      </w:r>
+      <w:proofErr w:type="spellStart"/>
+      <w:r>
+        <w:t>localhost</w:t>
+      </w:r>
+      <w:proofErr w:type="spellEnd"/>
+      <w:r>
+        <w:t>',</w:t>
+      </w:r>
+    </w:p>
+    <w:p>
+      <w:r>
+        <w:t xml:space="preserve">            </w:t>
+      </w:r>
+      <w:proofErr w:type="spellStart"/>
+      <w:r>
+        <w:t>user</w:t>
+      </w:r>
+      <w:proofErr w:type="spellEnd"/>
+      <w:r>
+        <w:t>: 'aluno',</w:t>
+      </w:r>
+    </w:p>
+    <w:p>
+      <w:r>
+        <w:t xml:space="preserve">            </w:t>
+      </w:r>
+      <w:proofErr w:type="spellStart"/>
+      <w:r>
+        <w:t>password</w:t>
+      </w:r>
+      <w:proofErr w:type="spellEnd"/>
+      <w:r>
+        <w:t>: 'Sptech#2024',</w:t>
+      </w:r>
+    </w:p>
+    <w:p>
+      <w:r>
+        <w:t xml:space="preserve">            </w:t>
+      </w:r>
+      <w:proofErr w:type="spellStart"/>
+      <w:r>
+        <w:t>database</w:t>
+      </w:r>
+      <w:proofErr w:type="spellEnd"/>
+      <w:r>
+        <w:t>: '</w:t>
+      </w:r>
+      <w:proofErr w:type="spellStart"/>
+      <w:r>
+        <w:t>MushTrack</w:t>
+      </w:r>
+      <w:proofErr w:type="spellEnd"/>
+      <w:r>
+        <w:t>',</w:t>
+      </w:r>
+    </w:p>
+    <w:p>
+      <w:r>
+        <w:t xml:space="preserve">            </w:t>
+      </w:r>
+      <w:proofErr w:type="spellStart"/>
+      <w:r>
+        <w:t>port</w:t>
+      </w:r>
+      <w:proofErr w:type="spellEnd"/>
+      <w:r>
+        <w:t>: 3307</w:t>
+      </w:r>
+    </w:p>
+    <w:p>
+      <w:r>
+        <w:t>        }</w:t>
+      </w:r>
+    </w:p>
+    <w:p>
+      <w:r>
+        <w:t xml:space="preserve">    </w:t>
+      </w:r>
+      <w:proofErr w:type="gramStart"/>
+      <w:r>
+        <w:t>).</w:t>
+      </w:r>
+      <w:proofErr w:type="spellStart"/>
+      <w:r>
+        <w:t>promise</w:t>
+      </w:r>
+      <w:proofErr w:type="spellEnd"/>
+      <w:proofErr w:type="gramEnd"/>
+      <w:r>
+        <w:t>();</w:t>
+      </w:r>
+    </w:p>
+    <w:p/>
+    <w:p>
+      <w:r>
+        <w:t>    // lista as portas seriais disponíveis e procura pelo Arduino</w:t>
+      </w:r>
+    </w:p>
+    <w:p>
+      <w:r>
+        <w:t xml:space="preserve">    </w:t>
+      </w:r>
+      <w:proofErr w:type="spellStart"/>
+      <w:r>
+        <w:rPr>
+          <w:i/>
+          <w:iCs/>
+        </w:rPr>
+        <w:t>const</w:t>
+      </w:r>
+      <w:proofErr w:type="spellEnd"/>
+      <w:r>
+        <w:t xml:space="preserve"> portas = </w:t>
+      </w:r>
+      <w:proofErr w:type="spellStart"/>
+      <w:r>
+        <w:t>await</w:t>
+      </w:r>
+      <w:proofErr w:type="spellEnd"/>
+      <w:r>
+        <w:t xml:space="preserve"> </w:t>
+      </w:r>
+      <w:proofErr w:type="spellStart"/>
+      <w:proofErr w:type="gramStart"/>
+      <w:r>
+        <w:t>serialport.SerialPort.list</w:t>
+      </w:r>
+      <w:proofErr w:type="spellEnd"/>
+      <w:proofErr w:type="gramEnd"/>
+      <w:r>
+        <w:t>();</w:t>
+      </w:r>
+    </w:p>
+    <w:p>
+      <w:r>
+        <w:t xml:space="preserve">    </w:t>
+      </w:r>
+      <w:proofErr w:type="spellStart"/>
+      <w:r>
+        <w:rPr>
+          <w:i/>
+          <w:iCs/>
+        </w:rPr>
+        <w:t>const</w:t>
+      </w:r>
+      <w:proofErr w:type="spellEnd"/>
+      <w:r>
+        <w:t xml:space="preserve"> </w:t>
+      </w:r>
+      <w:proofErr w:type="spellStart"/>
+      <w:r>
+        <w:t>portaArduino</w:t>
+      </w:r>
+      <w:proofErr w:type="spellEnd"/>
+      <w:r>
+        <w:t xml:space="preserve"> = </w:t>
+      </w:r>
+      <w:proofErr w:type="spellStart"/>
+      <w:proofErr w:type="gramStart"/>
+      <w:r>
+        <w:t>portas.find</w:t>
+      </w:r>
+      <w:proofErr w:type="spellEnd"/>
+      <w:proofErr w:type="gramEnd"/>
+      <w:r>
+        <w:t>((</w:t>
+      </w:r>
+      <w:r>
+        <w:rPr>
+          <w:i/>
+          <w:iCs/>
+        </w:rPr>
+        <w:t>porta</w:t>
+      </w:r>
+      <w:r>
+        <w:t xml:space="preserve">) </w:t>
+      </w:r>
+      <w:r>
+        <w:rPr>
+          <w:i/>
+          <w:iCs/>
+        </w:rPr>
+        <w:t>=&gt;</w:t>
+      </w:r>
+      <w:r>
+        <w:t xml:space="preserve"> </w:t>
+      </w:r>
+      <w:proofErr w:type="spellStart"/>
+      <w:proofErr w:type="gramStart"/>
+      <w:r>
+        <w:t>porta.vendorId</w:t>
+      </w:r>
+      <w:proofErr w:type="spellEnd"/>
+      <w:proofErr w:type="gramEnd"/>
+      <w:r>
+        <w:t xml:space="preserve"> == 2341 &amp;&amp; </w:t>
+      </w:r>
+      <w:proofErr w:type="spellStart"/>
+      <w:proofErr w:type="gramStart"/>
+      <w:r>
+        <w:t>porta.productId</w:t>
+      </w:r>
+      <w:proofErr w:type="spellEnd"/>
+      <w:proofErr w:type="gramEnd"/>
+      <w:r>
+        <w:t xml:space="preserve"> == 43);</w:t>
+      </w:r>
+    </w:p>
+    <w:p>
+      <w:r>
+        <w:t xml:space="preserve">    </w:t>
+      </w:r>
+      <w:proofErr w:type="spellStart"/>
+      <w:r>
+        <w:t>if</w:t>
+      </w:r>
+      <w:proofErr w:type="spellEnd"/>
+      <w:r>
+        <w:t xml:space="preserve"> </w:t>
+      </w:r>
+      <w:proofErr w:type="gramStart"/>
+      <w:r>
+        <w:t>(!</w:t>
+      </w:r>
+      <w:proofErr w:type="spellStart"/>
+      <w:r>
+        <w:t>portaArduino</w:t>
+      </w:r>
+      <w:proofErr w:type="spellEnd"/>
+      <w:proofErr w:type="gramEnd"/>
+      <w:r>
+        <w:t>) {</w:t>
+      </w:r>
+    </w:p>
+    <w:p>
+      <w:r>
+        <w:t xml:space="preserve">        </w:t>
+      </w:r>
+      <w:proofErr w:type="spellStart"/>
+      <w:r>
+        <w:t>throw</w:t>
+      </w:r>
+      <w:proofErr w:type="spellEnd"/>
+      <w:r>
+        <w:t xml:space="preserve"> new </w:t>
+      </w:r>
+      <w:proofErr w:type="spellStart"/>
+      <w:proofErr w:type="gramStart"/>
+      <w:r>
+        <w:t>Error</w:t>
+      </w:r>
+      <w:proofErr w:type="spellEnd"/>
+      <w:r>
+        <w:t>(</w:t>
+      </w:r>
+      <w:proofErr w:type="gramEnd"/>
+      <w:r>
+        <w:t xml:space="preserve">'O </w:t>
+      </w:r>
+      <w:proofErr w:type="spellStart"/>
+      <w:r>
+        <w:t>arduino</w:t>
+      </w:r>
+      <w:proofErr w:type="spellEnd"/>
+      <w:r>
+        <w:t xml:space="preserve"> não foi encontrado em nenhuma porta serial');</w:t>
+      </w:r>
+    </w:p>
+    <w:p>
+      <w:r>
+        <w:t>    }</w:t>
+      </w:r>
+    </w:p>
+    <w:p/>
+    <w:p>
+      <w:r>
+        <w:t xml:space="preserve">    // configura a porta serial com o </w:t>
+      </w:r>
+      <w:proofErr w:type="spellStart"/>
+      <w:r>
+        <w:t>baud</w:t>
+      </w:r>
+      <w:proofErr w:type="spellEnd"/>
+      <w:r>
+        <w:t xml:space="preserve"> rate especificado</w:t>
+      </w:r>
+    </w:p>
+    <w:p>
+      <w:r>
+        <w:t xml:space="preserve">    </w:t>
+      </w:r>
+      <w:proofErr w:type="spellStart"/>
+      <w:r>
+        <w:rPr>
+          <w:i/>
+          <w:iCs/>
+        </w:rPr>
+        <w:t>const</w:t>
+      </w:r>
+      <w:proofErr w:type="spellEnd"/>
+      <w:r>
+        <w:t xml:space="preserve"> </w:t>
+      </w:r>
+      <w:proofErr w:type="spellStart"/>
+      <w:r>
+        <w:t>arduino</w:t>
+      </w:r>
+      <w:proofErr w:type="spellEnd"/>
+      <w:r>
+        <w:t xml:space="preserve"> = new </w:t>
+      </w:r>
+      <w:proofErr w:type="spellStart"/>
+      <w:proofErr w:type="gramStart"/>
+      <w:r>
+        <w:t>serialport.SerialPort</w:t>
+      </w:r>
+      <w:proofErr w:type="spellEnd"/>
+      <w:proofErr w:type="gramEnd"/>
+      <w:r>
+        <w:t>(</w:t>
+      </w:r>
+    </w:p>
+    <w:p>
+      <w:r>
+        <w:t>        {</w:t>
+      </w:r>
+    </w:p>
+    <w:p>
+      <w:r>
+        <w:t xml:space="preserve">            path: </w:t>
+      </w:r>
+      <w:proofErr w:type="spellStart"/>
+      <w:r>
+        <w:t>portaArduino.path</w:t>
+      </w:r>
+      <w:proofErr w:type="spellEnd"/>
+      <w:r>
+        <w:t>,</w:t>
+      </w:r>
+    </w:p>
+    <w:p>
+      <w:r>
+        <w:t xml:space="preserve">            </w:t>
+      </w:r>
+      <w:proofErr w:type="spellStart"/>
+      <w:r>
+        <w:t>baudRate</w:t>
+      </w:r>
+      <w:proofErr w:type="spellEnd"/>
+      <w:r>
+        <w:t>: SERIAL_BAUD_RATE</w:t>
+      </w:r>
+    </w:p>
+    <w:p>
+      <w:r>
+        <w:t>        }</w:t>
+      </w:r>
+    </w:p>
+    <w:p>
+      <w:r>
+        <w:t>    );</w:t>
+      </w:r>
+    </w:p>
+    <w:p/>
+    <w:p>
+      <w:r>
+        <w:t>    // evento quando a porta serial é aberta</w:t>
+      </w:r>
+    </w:p>
+    <w:p>
+      <w:r>
+        <w:t xml:space="preserve">    </w:t>
+      </w:r>
+      <w:proofErr w:type="spellStart"/>
+      <w:proofErr w:type="gramStart"/>
+      <w:r>
+        <w:t>arduino.on</w:t>
+      </w:r>
+      <w:proofErr w:type="spellEnd"/>
+      <w:proofErr w:type="gramEnd"/>
+      <w:r>
+        <w:t xml:space="preserve">('open', () </w:t>
+      </w:r>
+      <w:r>
+        <w:rPr>
+          <w:i/>
+          <w:iCs/>
+        </w:rPr>
+        <w:t>=&gt;</w:t>
+      </w:r>
+      <w:r>
+        <w:t xml:space="preserve"> {</w:t>
+      </w:r>
+    </w:p>
+    <w:p>
+      <w:r>
+        <w:t xml:space="preserve">        </w:t>
+      </w:r>
+      <w:proofErr w:type="gramStart"/>
+      <w:r>
+        <w:t>console.log(</w:t>
+      </w:r>
+      <w:proofErr w:type="gramEnd"/>
+      <w:r>
+        <w:t xml:space="preserve">`A leitura do </w:t>
+      </w:r>
+      <w:proofErr w:type="spellStart"/>
+      <w:r>
+        <w:t>arduino</w:t>
+      </w:r>
+      <w:proofErr w:type="spellEnd"/>
+      <w:r>
+        <w:t xml:space="preserve"> foi iniciada na porta ${</w:t>
+      </w:r>
+      <w:proofErr w:type="spellStart"/>
+      <w:r>
+        <w:t>portaArduino.path</w:t>
+      </w:r>
+      <w:proofErr w:type="spellEnd"/>
+      <w:r>
+        <w:t xml:space="preserve">} utilizando </w:t>
+      </w:r>
+      <w:proofErr w:type="spellStart"/>
+      <w:r>
+        <w:t>Baud</w:t>
+      </w:r>
+      <w:proofErr w:type="spellEnd"/>
+      <w:r>
+        <w:t xml:space="preserve"> Rate de ${SERIAL_BAUD_</w:t>
+      </w:r>
+      <w:proofErr w:type="gramStart"/>
+      <w:r>
+        <w:t>RATE}`</w:t>
+      </w:r>
+      <w:proofErr w:type="gramEnd"/>
+      <w:r>
+        <w:t>);</w:t>
+      </w:r>
+    </w:p>
+    <w:p>
+      <w:r>
+        <w:t>    });</w:t>
+      </w:r>
+    </w:p>
+    <w:p/>
+    <w:p>
+      <w:r>
+        <w:t>    // processa os dados recebidos do Arduino</w:t>
+      </w:r>
+    </w:p>
+    <w:p>
+      <w:r>
+        <w:t xml:space="preserve">    </w:t>
+      </w:r>
+      <w:proofErr w:type="spellStart"/>
+      <w:proofErr w:type="gramStart"/>
+      <w:r>
+        <w:t>arduino.pipe</w:t>
+      </w:r>
+      <w:proofErr w:type="spellEnd"/>
+      <w:proofErr w:type="gramEnd"/>
+      <w:r>
+        <w:t xml:space="preserve">(new </w:t>
+      </w:r>
+      <w:proofErr w:type="spellStart"/>
+      <w:proofErr w:type="gramStart"/>
+      <w:r>
+        <w:t>serialport.ReadlineParser</w:t>
+      </w:r>
+      <w:proofErr w:type="spellEnd"/>
+      <w:r>
+        <w:t xml:space="preserve">({ </w:t>
+      </w:r>
+      <w:proofErr w:type="spellStart"/>
+      <w:r>
+        <w:t>delimiter</w:t>
+      </w:r>
+      <w:proofErr w:type="spellEnd"/>
+      <w:proofErr w:type="gramEnd"/>
+      <w:r>
+        <w:t>: '\r\n</w:t>
+      </w:r>
+      <w:proofErr w:type="gramStart"/>
+      <w:r>
+        <w:t>' })).</w:t>
+      </w:r>
+      <w:proofErr w:type="spellStart"/>
+      <w:r>
+        <w:t>on</w:t>
+      </w:r>
+      <w:proofErr w:type="spellEnd"/>
+      <w:proofErr w:type="gramEnd"/>
+      <w:r>
+        <w:t xml:space="preserve">('data', </w:t>
+      </w:r>
+      <w:proofErr w:type="spellStart"/>
+      <w:r>
+        <w:t>async</w:t>
+      </w:r>
+      <w:proofErr w:type="spellEnd"/>
+      <w:r>
+        <w:t xml:space="preserve"> (</w:t>
+      </w:r>
+      <w:r>
+        <w:rPr>
+          <w:i/>
+          <w:iCs/>
+        </w:rPr>
+        <w:t>data</w:t>
+      </w:r>
+      <w:r>
+        <w:t xml:space="preserve">) </w:t>
+      </w:r>
+      <w:r>
+        <w:rPr>
+          <w:i/>
+          <w:iCs/>
+        </w:rPr>
+        <w:t>=&gt;</w:t>
+      </w:r>
+      <w:r>
+        <w:t xml:space="preserve"> {</w:t>
+      </w:r>
+    </w:p>
+    <w:p>
+      <w:r>
+        <w:t>        //console.log(data);</w:t>
+      </w:r>
+    </w:p>
+    <w:p>
+      <w:r>
+        <w:t xml:space="preserve">        </w:t>
+      </w:r>
+      <w:proofErr w:type="spellStart"/>
+      <w:r>
+        <w:rPr>
+          <w:i/>
+          <w:iCs/>
+        </w:rPr>
+        <w:t>const</w:t>
+      </w:r>
+      <w:proofErr w:type="spellEnd"/>
+      <w:r>
+        <w:t xml:space="preserve"> valores = </w:t>
+      </w:r>
+      <w:proofErr w:type="spellStart"/>
+      <w:proofErr w:type="gramStart"/>
+      <w:r>
+        <w:t>data.split</w:t>
+      </w:r>
+      <w:proofErr w:type="spellEnd"/>
+      <w:proofErr w:type="gramEnd"/>
+      <w:r>
+        <w:t>(';');</w:t>
+      </w:r>
+    </w:p>
+    <w:p>
+      <w:r>
+        <w:lastRenderedPageBreak/>
+        <w:t xml:space="preserve">      </w:t>
+      </w:r>
+    </w:p>
+    <w:p>
+      <w:r>
+        <w:t xml:space="preserve">        </w:t>
+      </w:r>
+      <w:proofErr w:type="spellStart"/>
+      <w:r>
+        <w:rPr>
+          <w:i/>
+          <w:iCs/>
+        </w:rPr>
+        <w:t>const</w:t>
+      </w:r>
+      <w:proofErr w:type="spellEnd"/>
+      <w:r>
+        <w:t xml:space="preserve"> sensorLM35 = </w:t>
+      </w:r>
+      <w:proofErr w:type="spellStart"/>
+      <w:r>
+        <w:t>parseFloat</w:t>
+      </w:r>
+      <w:proofErr w:type="spellEnd"/>
+      <w:r>
+        <w:t>(</w:t>
+      </w:r>
+      <w:proofErr w:type="gramStart"/>
+      <w:r>
+        <w:t>valores[</w:t>
+      </w:r>
+      <w:proofErr w:type="gramEnd"/>
+      <w:r>
+        <w:t>0]);</w:t>
+      </w:r>
+    </w:p>
+    <w:p>
+      <w:r>
+        <w:t xml:space="preserve">        </w:t>
+      </w:r>
+      <w:proofErr w:type="spellStart"/>
+      <w:r>
+        <w:rPr>
+          <w:i/>
+          <w:iCs/>
+        </w:rPr>
+        <w:t>const</w:t>
+      </w:r>
+      <w:proofErr w:type="spellEnd"/>
+      <w:r>
+        <w:t xml:space="preserve"> sensorDHT11 = </w:t>
+      </w:r>
+      <w:proofErr w:type="spellStart"/>
+      <w:r>
+        <w:t>parseFloat</w:t>
+      </w:r>
+      <w:proofErr w:type="spellEnd"/>
+      <w:r>
+        <w:t>(</w:t>
+      </w:r>
+      <w:proofErr w:type="gramStart"/>
+      <w:r>
+        <w:t>valores[</w:t>
+      </w:r>
+      <w:proofErr w:type="gramEnd"/>
+      <w:r>
+        <w:t>1]);</w:t>
+      </w:r>
+    </w:p>
+    <w:p/>
+    <w:p>
+      <w:r>
+        <w:t xml:space="preserve">        // armazena os valores dos sensores nos </w:t>
+      </w:r>
+      <w:proofErr w:type="spellStart"/>
+      <w:r>
+        <w:t>arrays</w:t>
+      </w:r>
+      <w:proofErr w:type="spellEnd"/>
+      <w:r>
+        <w:t xml:space="preserve"> correspondentes</w:t>
+      </w:r>
+    </w:p>
+    <w:p>
+      <w:r>
+        <w:t xml:space="preserve">        </w:t>
+      </w:r>
+      <w:proofErr w:type="spellStart"/>
+      <w:r>
+        <w:t>valoresSensorUmidade.push</w:t>
+      </w:r>
+      <w:proofErr w:type="spellEnd"/>
+      <w:r>
+        <w:t>(sensorDHT11);</w:t>
+      </w:r>
+    </w:p>
+    <w:p>
+      <w:r>
+        <w:t xml:space="preserve">        </w:t>
+      </w:r>
+      <w:proofErr w:type="spellStart"/>
+      <w:r>
+        <w:t>valoresSensorTemperatura.push</w:t>
+      </w:r>
+      <w:proofErr w:type="spellEnd"/>
+      <w:r>
+        <w:t>(sensorLM35);</w:t>
+      </w:r>
+    </w:p>
+    <w:p/>
+    <w:p>
+      <w:r>
+        <w:t>        // insere os dados no banco de dados (se habilitado)</w:t>
+      </w:r>
+    </w:p>
+    <w:p>
+      <w:r>
+        <w:t xml:space="preserve">        </w:t>
+      </w:r>
+      <w:proofErr w:type="spellStart"/>
+      <w:r>
+        <w:t>if</w:t>
+      </w:r>
+      <w:proofErr w:type="spellEnd"/>
+      <w:r>
+        <w:t xml:space="preserve"> (HABILITAR_OPERACAO_INSERIR) {</w:t>
+      </w:r>
+    </w:p>
+    <w:p>
+      <w:r>
+        <w:t xml:space="preserve">            </w:t>
+      </w:r>
+      <w:proofErr w:type="gramStart"/>
+      <w:r>
+        <w:t>console.log(</w:t>
+      </w:r>
+      <w:proofErr w:type="gramEnd"/>
+      <w:r>
+        <w:t xml:space="preserve">"valores inseridos no banco: ", </w:t>
+      </w:r>
+      <w:proofErr w:type="spellStart"/>
+      <w:r>
+        <w:t>valoresSensorTemperatura</w:t>
+      </w:r>
+      <w:proofErr w:type="spellEnd"/>
+      <w:r>
+        <w:t xml:space="preserve"> + ", " +</w:t>
+      </w:r>
+      <w:proofErr w:type="spellStart"/>
+      <w:proofErr w:type="gramStart"/>
+      <w:r>
+        <w:t>valoresSensorUmidade</w:t>
+      </w:r>
+      <w:proofErr w:type="spellEnd"/>
+      <w:r>
+        <w:t xml:space="preserve"> )</w:t>
+      </w:r>
+      <w:proofErr w:type="gramEnd"/>
+      <w:r>
+        <w:t>;</w:t>
+      </w:r>
+    </w:p>
+    <w:p>
+      <w:r>
+        <w:t xml:space="preserve">            // este </w:t>
+      </w:r>
+      <w:proofErr w:type="spellStart"/>
+      <w:r>
+        <w:t>insert</w:t>
+      </w:r>
+      <w:proofErr w:type="spellEnd"/>
+      <w:r>
+        <w:t xml:space="preserve"> irá inserir os dados na tabela "medida"</w:t>
+      </w:r>
+    </w:p>
+    <w:p>
+      <w:r>
+        <w:t xml:space="preserve">            </w:t>
+      </w:r>
+      <w:proofErr w:type="spellStart"/>
+      <w:r>
+        <w:t>await</w:t>
+      </w:r>
+      <w:proofErr w:type="spellEnd"/>
+      <w:r>
+        <w:t xml:space="preserve"> </w:t>
+      </w:r>
+      <w:proofErr w:type="spellStart"/>
+      <w:r>
+        <w:t>poolBancoDados.execute</w:t>
+      </w:r>
+      <w:proofErr w:type="spellEnd"/>
+      <w:r>
+        <w:t>(</w:t>
+      </w:r>
+    </w:p>
+    <w:p>
+      <w:r>
+        <w:t xml:space="preserve">                //'SELECT * FROM </w:t>
+      </w:r>
+      <w:proofErr w:type="spellStart"/>
+      <w:r>
+        <w:t>Historico</w:t>
+      </w:r>
+      <w:proofErr w:type="spellEnd"/>
+      <w:r>
+        <w:t>;'</w:t>
+      </w:r>
+    </w:p>
+    <w:p>
+      <w:r>
+        <w:t xml:space="preserve">                // 'INSERT INTO </w:t>
+      </w:r>
+      <w:proofErr w:type="spellStart"/>
+      <w:r>
+        <w:t>Historico</w:t>
+      </w:r>
+      <w:proofErr w:type="spellEnd"/>
+      <w:r>
+        <w:t>(</w:t>
+      </w:r>
+      <w:proofErr w:type="spellStart"/>
+      <w:r>
+        <w:t>valorUmidade</w:t>
+      </w:r>
+      <w:proofErr w:type="spellEnd"/>
+      <w:r>
+        <w:t>) VALUES (?);',</w:t>
+      </w:r>
+    </w:p>
+    <w:p>
+      <w:r>
+        <w:t>                // [sensorDHT11],</w:t>
+      </w:r>
+    </w:p>
+    <w:p>
+      <w:r>
+        <w:t xml:space="preserve">                // 'INSERT INTO </w:t>
+      </w:r>
+      <w:proofErr w:type="spellStart"/>
+      <w:r>
+        <w:t>Historico</w:t>
+      </w:r>
+      <w:proofErr w:type="spellEnd"/>
+      <w:r>
+        <w:t>(</w:t>
+      </w:r>
+      <w:proofErr w:type="spellStart"/>
+      <w:r>
+        <w:t>valorTemperatura</w:t>
+      </w:r>
+      <w:proofErr w:type="spellEnd"/>
+      <w:r>
+        <w:t>) VALUES (?);',</w:t>
+      </w:r>
+    </w:p>
+    <w:p>
+      <w:r>
+        <w:t>                // [sensorLM35]</w:t>
+      </w:r>
+    </w:p>
+    <w:p>
+      <w:r>
+        <w:t xml:space="preserve">                //'INSERT INTO </w:t>
+      </w:r>
+      <w:proofErr w:type="spellStart"/>
+      <w:r>
+        <w:t>Historico</w:t>
+      </w:r>
+      <w:proofErr w:type="spellEnd"/>
+      <w:r>
+        <w:t xml:space="preserve"> (data, </w:t>
+      </w:r>
+      <w:proofErr w:type="spellStart"/>
+      <w:r>
+        <w:t>valorUmidade</w:t>
+      </w:r>
+      <w:proofErr w:type="spellEnd"/>
+      <w:r>
+        <w:t xml:space="preserve">, </w:t>
+      </w:r>
+      <w:proofErr w:type="spellStart"/>
+      <w:r>
+        <w:t>valorTemperatura</w:t>
+      </w:r>
+      <w:proofErr w:type="spellEnd"/>
+      <w:r>
+        <w:t>) VALUES (2025-04-08, '+</w:t>
+      </w:r>
+      <w:proofErr w:type="spellStart"/>
+      <w:r>
+        <w:t>valoresSensorUmidade</w:t>
+      </w:r>
+      <w:proofErr w:type="spellEnd"/>
+      <w:r>
+        <w:t>+','+</w:t>
+      </w:r>
+      <w:proofErr w:type="spellStart"/>
+      <w:r>
+        <w:t>valoresSensorTemperatura</w:t>
+      </w:r>
+      <w:proofErr w:type="spellEnd"/>
+      <w:r>
+        <w:t>+');',</w:t>
+      </w:r>
+    </w:p>
+    <w:p>
+      <w:r>
+        <w:t xml:space="preserve">                'INSERT INTO </w:t>
+      </w:r>
+      <w:proofErr w:type="spellStart"/>
+      <w:r>
+        <w:t>Historico</w:t>
+      </w:r>
+      <w:proofErr w:type="spellEnd"/>
+      <w:r>
+        <w:t xml:space="preserve"> (</w:t>
+      </w:r>
+      <w:proofErr w:type="spellStart"/>
+      <w:r>
+        <w:t>valorUmidade</w:t>
+      </w:r>
+      <w:proofErr w:type="spellEnd"/>
+      <w:r>
+        <w:t xml:space="preserve">, </w:t>
+      </w:r>
+      <w:proofErr w:type="spellStart"/>
+      <w:r>
+        <w:t>valorTemperatura</w:t>
+      </w:r>
+      <w:proofErr w:type="spellEnd"/>
+      <w:r>
+        <w:t xml:space="preserve">) VALUES </w:t>
+      </w:r>
+      <w:proofErr w:type="gramStart"/>
+      <w:r>
+        <w:t>(?,?</w:t>
+      </w:r>
+      <w:proofErr w:type="gramEnd"/>
+      <w:r>
+        <w:t>);',</w:t>
+      </w:r>
+    </w:p>
+    <w:p>
+      <w:r>
+        <w:t>                 [sensorDHT11, sensorLM35]</w:t>
+      </w:r>
+    </w:p>
+    <w:p>
+      <w:r>
+        <w:t>            );</w:t>
+      </w:r>
+    </w:p>
+    <w:p>
+      <w:r>
+        <w:t xml:space="preserve">        </w:t>
+      </w:r>
+    </w:p>
+    <w:p/>
+    <w:p>
+      <w:r>
+        <w:t>        }</w:t>
+      </w:r>
+    </w:p>
+    <w:p/>
+    <w:p>
+      <w:r>
+        <w:t>    });</w:t>
+      </w:r>
+    </w:p>
+    <w:p/>
+    <w:p>
+      <w:r>
+        <w:t>    // evento para lidar com erros na comunicação serial</w:t>
+      </w:r>
+    </w:p>
+    <w:p>
+      <w:r>
+        <w:t xml:space="preserve">    </w:t>
+      </w:r>
+      <w:proofErr w:type="spellStart"/>
+      <w:proofErr w:type="gramStart"/>
+      <w:r>
+        <w:t>arduino.on</w:t>
+      </w:r>
+      <w:proofErr w:type="spellEnd"/>
+      <w:proofErr w:type="gramEnd"/>
+      <w:r>
+        <w:t>('</w:t>
+      </w:r>
+      <w:proofErr w:type="spellStart"/>
+      <w:r>
+        <w:t>error</w:t>
+      </w:r>
+      <w:proofErr w:type="spellEnd"/>
+      <w:r>
+        <w:t>', (</w:t>
+      </w:r>
+      <w:r>
+        <w:rPr>
+          <w:i/>
+          <w:iCs/>
+        </w:rPr>
+        <w:t>mensagem</w:t>
+      </w:r>
+      <w:r>
+        <w:t xml:space="preserve">) </w:t>
+      </w:r>
+      <w:r>
+        <w:rPr>
+          <w:i/>
+          <w:iCs/>
+        </w:rPr>
+        <w:t>=&gt;</w:t>
+      </w:r>
+      <w:r>
+        <w:t xml:space="preserve"> {</w:t>
+      </w:r>
+    </w:p>
+    <w:p>
+      <w:r>
+        <w:t xml:space="preserve">        </w:t>
+      </w:r>
+      <w:proofErr w:type="spellStart"/>
+      <w:proofErr w:type="gramStart"/>
+      <w:r>
+        <w:t>console.error</w:t>
+      </w:r>
+      <w:proofErr w:type="spellEnd"/>
+      <w:proofErr w:type="gramEnd"/>
+      <w:r>
+        <w:t xml:space="preserve">(`Erro no </w:t>
+      </w:r>
+      <w:proofErr w:type="spellStart"/>
+      <w:r>
+        <w:t>arduino</w:t>
+      </w:r>
+      <w:proofErr w:type="spellEnd"/>
+      <w:r>
+        <w:t xml:space="preserve"> (Mensagem: ${mensagem} ---------------------------`)</w:t>
+      </w:r>
+    </w:p>
+    <w:p>
+      <w:r>
+        <w:t>    });</w:t>
+      </w:r>
+    </w:p>
+    <w:p>
+      <w:r>
+        <w:t>}</w:t>
+      </w:r>
+    </w:p>
+    <w:p/>
+    <w:p>
+      <w:r>
+        <w:t>// função para criar e configurar o servidor web</w:t>
+      </w:r>
+    </w:p>
+    <w:p>
+      <w:proofErr w:type="spellStart"/>
+      <w:r>
+        <w:rPr>
+          <w:i/>
+          <w:iCs/>
+        </w:rPr>
+        <w:t>const</w:t>
+      </w:r>
+      <w:proofErr w:type="spellEnd"/>
+      <w:r>
+        <w:t xml:space="preserve"> servidor = (</w:t>
+      </w:r>
+    </w:p>
+    <w:p>
+      <w:r>
+        <w:t xml:space="preserve">    </w:t>
+      </w:r>
+      <w:proofErr w:type="spellStart"/>
+      <w:r>
+        <w:rPr>
+          <w:i/>
+          <w:iCs/>
+        </w:rPr>
+        <w:t>valoresSensorUmidade</w:t>
+      </w:r>
+      <w:proofErr w:type="spellEnd"/>
+      <w:r>
+        <w:t>,</w:t>
+      </w:r>
+    </w:p>
+    <w:p>
+      <w:r>
+        <w:t xml:space="preserve">    </w:t>
+      </w:r>
+      <w:proofErr w:type="spellStart"/>
+      <w:r>
+        <w:rPr>
+          <w:i/>
+          <w:iCs/>
+        </w:rPr>
+        <w:t>valoresSensorTemperatura</w:t>
+      </w:r>
+      <w:proofErr w:type="spellEnd"/>
+    </w:p>
+    <w:p>
+      <w:r>
+        <w:t xml:space="preserve">) </w:t>
+      </w:r>
+      <w:r>
+        <w:rPr>
+          <w:i/>
+          <w:iCs/>
+        </w:rPr>
+        <w:t>=&gt;</w:t>
+      </w:r>
+      <w:r>
+        <w:t xml:space="preserve"> {</w:t>
+      </w:r>
+    </w:p>
+    <w:p>
+      <w:r>
+        <w:t xml:space="preserve">    </w:t>
+      </w:r>
+      <w:proofErr w:type="spellStart"/>
+      <w:r>
+        <w:rPr>
+          <w:i/>
+          <w:iCs/>
+        </w:rPr>
+        <w:t>const</w:t>
+      </w:r>
+      <w:proofErr w:type="spellEnd"/>
+      <w:r>
+        <w:t xml:space="preserve"> app = </w:t>
+      </w:r>
+      <w:proofErr w:type="spellStart"/>
+      <w:proofErr w:type="gramStart"/>
+      <w:r>
+        <w:t>express</w:t>
+      </w:r>
+      <w:proofErr w:type="spellEnd"/>
+      <w:r>
+        <w:t>(</w:t>
+      </w:r>
+      <w:proofErr w:type="gramEnd"/>
+      <w:r>
+        <w:t>);</w:t>
+      </w:r>
+    </w:p>
+    <w:p/>
+    <w:p>
+      <w:r>
+        <w:t>    // configurações de requisição e resposta</w:t>
+      </w:r>
+    </w:p>
+    <w:p>
+      <w:r>
+        <w:t xml:space="preserve">    </w:t>
+      </w:r>
+      <w:proofErr w:type="spellStart"/>
+      <w:proofErr w:type="gramStart"/>
+      <w:r>
+        <w:t>app.use</w:t>
+      </w:r>
+      <w:proofErr w:type="spellEnd"/>
+      <w:r>
+        <w:t>(</w:t>
+      </w:r>
+      <w:proofErr w:type="gramEnd"/>
+      <w:r>
+        <w:t>(</w:t>
+      </w:r>
+      <w:proofErr w:type="spellStart"/>
+      <w:r>
+        <w:rPr>
+          <w:i/>
+          <w:iCs/>
+        </w:rPr>
+        <w:t>request</w:t>
+      </w:r>
+      <w:proofErr w:type="spellEnd"/>
+      <w:r>
+        <w:t xml:space="preserve">, </w:t>
+      </w:r>
+      <w:r>
+        <w:rPr>
+          <w:i/>
+          <w:iCs/>
+        </w:rPr>
+        <w:t>response</w:t>
+      </w:r>
+      <w:r>
+        <w:t xml:space="preserve">, </w:t>
+      </w:r>
+      <w:proofErr w:type="spellStart"/>
+      <w:r>
+        <w:rPr>
+          <w:i/>
+          <w:iCs/>
+        </w:rPr>
+        <w:t>next</w:t>
+      </w:r>
+      <w:proofErr w:type="spellEnd"/>
+      <w:r>
+        <w:t xml:space="preserve">) </w:t>
+      </w:r>
+      <w:r>
+        <w:rPr>
+          <w:i/>
+          <w:iCs/>
+        </w:rPr>
+        <w:t>=&gt;</w:t>
+      </w:r>
+      <w:r>
+        <w:t xml:space="preserve"> {</w:t>
+      </w:r>
+    </w:p>
+    <w:p>
+      <w:r>
+        <w:t xml:space="preserve">        </w:t>
+      </w:r>
+      <w:proofErr w:type="spellStart"/>
+      <w:proofErr w:type="gramStart"/>
+      <w:r>
+        <w:t>response.header</w:t>
+      </w:r>
+      <w:proofErr w:type="spellEnd"/>
+      <w:proofErr w:type="gramEnd"/>
+      <w:r>
+        <w:t>('Access-</w:t>
+      </w:r>
+      <w:proofErr w:type="spellStart"/>
+      <w:r>
+        <w:t>Control</w:t>
+      </w:r>
+      <w:proofErr w:type="spellEnd"/>
+      <w:r>
+        <w:t>-</w:t>
+      </w:r>
+      <w:proofErr w:type="spellStart"/>
+      <w:r>
+        <w:t>Allow-Origin</w:t>
+      </w:r>
+      <w:proofErr w:type="spellEnd"/>
+      <w:r>
+        <w:t>', '*');</w:t>
+      </w:r>
+    </w:p>
+    <w:p>
+      <w:r>
+        <w:t xml:space="preserve">        </w:t>
+      </w:r>
+      <w:proofErr w:type="spellStart"/>
+      <w:proofErr w:type="gramStart"/>
+      <w:r>
+        <w:t>response.header</w:t>
+      </w:r>
+      <w:proofErr w:type="spellEnd"/>
+      <w:proofErr w:type="gramEnd"/>
+      <w:r>
+        <w:t>('Access-</w:t>
+      </w:r>
+      <w:proofErr w:type="spellStart"/>
+      <w:r>
+        <w:t>Control</w:t>
+      </w:r>
+      <w:proofErr w:type="spellEnd"/>
+      <w:r>
+        <w:t>-</w:t>
+      </w:r>
+      <w:proofErr w:type="spellStart"/>
+      <w:r>
+        <w:t>Allow-Headers</w:t>
+      </w:r>
+      <w:proofErr w:type="spellEnd"/>
+      <w:r>
+        <w:t>', '</w:t>
+      </w:r>
+      <w:proofErr w:type="spellStart"/>
+      <w:r>
+        <w:t>Origin</w:t>
+      </w:r>
+      <w:proofErr w:type="spellEnd"/>
+      <w:r>
+        <w:t xml:space="preserve">, </w:t>
+      </w:r>
+      <w:proofErr w:type="spellStart"/>
+      <w:r>
+        <w:t>Content-Type</w:t>
+      </w:r>
+      <w:proofErr w:type="spellEnd"/>
+      <w:r>
+        <w:t xml:space="preserve">, </w:t>
+      </w:r>
+      <w:proofErr w:type="spellStart"/>
+      <w:r>
+        <w:t>Accept</w:t>
+      </w:r>
+      <w:proofErr w:type="spellEnd"/>
+      <w:r>
+        <w:t>');</w:t>
+      </w:r>
+    </w:p>
+    <w:p>
+      <w:r>
+        <w:t xml:space="preserve">        </w:t>
+      </w:r>
+      <w:proofErr w:type="spellStart"/>
+      <w:proofErr w:type="gramStart"/>
+      <w:r>
+        <w:t>next</w:t>
+      </w:r>
+      <w:proofErr w:type="spellEnd"/>
+      <w:r>
+        <w:t>(</w:t>
+      </w:r>
+      <w:proofErr w:type="gramEnd"/>
+      <w:r>
+        <w:t>);</w:t>
+      </w:r>
+    </w:p>
+    <w:p>
+      <w:r>
+        <w:t>    });</w:t>
+      </w:r>
+    </w:p>
+    <w:p/>
+    <w:p>
+      <w:r>
+        <w:t>    // inicia o servidor na porta especificada</w:t>
+      </w:r>
+    </w:p>
+    <w:p>
+      <w:r>
+        <w:t xml:space="preserve">    </w:t>
+      </w:r>
+      <w:proofErr w:type="spellStart"/>
+      <w:proofErr w:type="gramStart"/>
+      <w:r>
+        <w:t>app.listen</w:t>
+      </w:r>
+      <w:proofErr w:type="spellEnd"/>
+      <w:proofErr w:type="gramEnd"/>
+      <w:r>
+        <w:t xml:space="preserve">(SERVIDOR_PORTA, () </w:t>
+      </w:r>
+      <w:r>
+        <w:rPr>
+          <w:i/>
+          <w:iCs/>
+        </w:rPr>
+        <w:t>=&gt;</w:t>
+      </w:r>
+      <w:r>
+        <w:t xml:space="preserve"> {</w:t>
+      </w:r>
+    </w:p>
+    <w:p>
+      <w:r>
+        <w:t xml:space="preserve">        </w:t>
+      </w:r>
+      <w:proofErr w:type="gramStart"/>
+      <w:r>
+        <w:t>console.log(</w:t>
+      </w:r>
+      <w:proofErr w:type="gramEnd"/>
+      <w:r>
+        <w:t>`API executada com sucesso na porta ${SERVIDOR_</w:t>
+      </w:r>
+      <w:proofErr w:type="gramStart"/>
+      <w:r>
+        <w:t>PORTA}`</w:t>
+      </w:r>
+      <w:proofErr w:type="gramEnd"/>
+      <w:r>
+        <w:t>);</w:t>
+      </w:r>
+    </w:p>
+    <w:p>
+      <w:r>
+        <w:t>    });</w:t>
+      </w:r>
+    </w:p>
+    <w:p/>
+    <w:p>
+      <w:r>
+        <w:t xml:space="preserve">    // define os </w:t>
+      </w:r>
+      <w:proofErr w:type="spellStart"/>
+      <w:r>
+        <w:t>endpoints</w:t>
+      </w:r>
+      <w:proofErr w:type="spellEnd"/>
+      <w:r>
+        <w:t xml:space="preserve"> da API para cada tipo de sensor</w:t>
+      </w:r>
+    </w:p>
+    <w:p>
+      <w:r>
+        <w:t xml:space="preserve">    </w:t>
+      </w:r>
+      <w:proofErr w:type="spellStart"/>
+      <w:proofErr w:type="gramStart"/>
+      <w:r>
+        <w:t>app.get</w:t>
+      </w:r>
+      <w:proofErr w:type="spellEnd"/>
+      <w:r>
+        <w:t>(</w:t>
+      </w:r>
+      <w:proofErr w:type="gramEnd"/>
+      <w:r>
+        <w:t>'/sensores/</w:t>
+      </w:r>
+      <w:proofErr w:type="spellStart"/>
+      <w:r>
+        <w:t>analogico</w:t>
+      </w:r>
+      <w:proofErr w:type="spellEnd"/>
+      <w:r>
+        <w:t>', (</w:t>
+      </w:r>
+      <w:r>
+        <w:rPr>
+          <w:i/>
+          <w:iCs/>
+        </w:rPr>
+        <w:t>_</w:t>
+      </w:r>
+      <w:r>
+        <w:t xml:space="preserve">, </w:t>
+      </w:r>
+      <w:r>
+        <w:rPr>
+          <w:i/>
+          <w:iCs/>
+        </w:rPr>
+        <w:t>response</w:t>
+      </w:r>
+      <w:r>
+        <w:t xml:space="preserve">) </w:t>
+      </w:r>
+      <w:r>
+        <w:rPr>
+          <w:i/>
+          <w:iCs/>
+        </w:rPr>
+        <w:t>=&gt;</w:t>
+      </w:r>
+      <w:r>
+        <w:t xml:space="preserve"> {</w:t>
+      </w:r>
+    </w:p>
+    <w:p>
+      <w:r>
+        <w:t xml:space="preserve">        </w:t>
+      </w:r>
+      <w:proofErr w:type="spellStart"/>
+      <w:r>
+        <w:t>return</w:t>
+      </w:r>
+      <w:proofErr w:type="spellEnd"/>
+      <w:r>
+        <w:t xml:space="preserve"> </w:t>
+      </w:r>
+      <w:proofErr w:type="spellStart"/>
+      <w:proofErr w:type="gramStart"/>
+      <w:r>
+        <w:t>response.json</w:t>
+      </w:r>
+      <w:proofErr w:type="spellEnd"/>
+      <w:proofErr w:type="gramEnd"/>
+      <w:r>
+        <w:t>(</w:t>
+      </w:r>
+      <w:proofErr w:type="spellStart"/>
+      <w:r>
+        <w:t>valoresSensorUmidade</w:t>
+      </w:r>
+      <w:proofErr w:type="spellEnd"/>
+      <w:r>
+        <w:t>);</w:t>
+      </w:r>
+    </w:p>
+    <w:p>
+      <w:r>
+        <w:t>    });</w:t>
+      </w:r>
+    </w:p>
+    <w:p>
+      <w:r>
+        <w:t xml:space="preserve">    </w:t>
+      </w:r>
+      <w:proofErr w:type="spellStart"/>
+      <w:proofErr w:type="gramStart"/>
+      <w:r>
+        <w:t>app.get</w:t>
+      </w:r>
+      <w:proofErr w:type="spellEnd"/>
+      <w:r>
+        <w:t>(</w:t>
+      </w:r>
+      <w:proofErr w:type="gramEnd"/>
+      <w:r>
+        <w:t>'/sensores/digital', (</w:t>
+      </w:r>
+      <w:r>
+        <w:rPr>
+          <w:i/>
+          <w:iCs/>
+        </w:rPr>
+        <w:t>_</w:t>
+      </w:r>
+      <w:r>
+        <w:t xml:space="preserve">, </w:t>
+      </w:r>
+      <w:r>
+        <w:rPr>
+          <w:i/>
+          <w:iCs/>
+        </w:rPr>
+        <w:t>response</w:t>
+      </w:r>
+      <w:r>
+        <w:t xml:space="preserve">) </w:t>
+      </w:r>
+      <w:r>
+        <w:rPr>
+          <w:i/>
+          <w:iCs/>
+        </w:rPr>
+        <w:t>=&gt;</w:t>
+      </w:r>
+      <w:r>
+        <w:t xml:space="preserve"> {</w:t>
+      </w:r>
+    </w:p>
+    <w:p>
+      <w:r>
+        <w:t xml:space="preserve">        </w:t>
+      </w:r>
+      <w:proofErr w:type="spellStart"/>
+      <w:r>
+        <w:t>return</w:t>
+      </w:r>
+      <w:proofErr w:type="spellEnd"/>
+      <w:r>
+        <w:t xml:space="preserve"> </w:t>
+      </w:r>
+      <w:proofErr w:type="spellStart"/>
+      <w:proofErr w:type="gramStart"/>
+      <w:r>
+        <w:t>response.json</w:t>
+      </w:r>
+      <w:proofErr w:type="spellEnd"/>
+      <w:proofErr w:type="gramEnd"/>
+      <w:r>
+        <w:t>(</w:t>
+      </w:r>
+      <w:proofErr w:type="spellStart"/>
+      <w:r>
+        <w:t>valoresSensorTemperatura</w:t>
+      </w:r>
+      <w:proofErr w:type="spellEnd"/>
+      <w:r>
+        <w:t>);</w:t>
+      </w:r>
+    </w:p>
+    <w:p>
+      <w:r>
+        <w:t>    });</w:t>
+      </w:r>
+    </w:p>
+    <w:p>
+      <w:r>
+        <w:t>}</w:t>
+      </w:r>
+    </w:p>
+    <w:p/>
+    <w:p>
+      <w:r>
+        <w:t>// função principal assíncrona para iniciar a comunicação serial e o servidor web</w:t>
+      </w:r>
+    </w:p>
+    <w:p>
+      <w:r>
+        <w:t>(</w:t>
+      </w:r>
+      <w:proofErr w:type="spellStart"/>
+      <w:r>
+        <w:t>async</w:t>
+      </w:r>
+      <w:proofErr w:type="spellEnd"/>
+      <w:r>
+        <w:t xml:space="preserve"> () </w:t>
+      </w:r>
+      <w:r>
+        <w:rPr>
+          <w:i/>
+          <w:iCs/>
+        </w:rPr>
+        <w:t>=&gt;</w:t>
+      </w:r>
+      <w:r>
+        <w:t xml:space="preserve"> {</w:t>
+      </w:r>
+    </w:p>
+    <w:p>
+      <w:r>
+        <w:t xml:space="preserve">    // </w:t>
+      </w:r>
+      <w:proofErr w:type="spellStart"/>
+      <w:r>
+        <w:t>arrays</w:t>
+      </w:r>
+      <w:proofErr w:type="spellEnd"/>
+      <w:r>
+        <w:t xml:space="preserve"> para armazenar os valores dos sensores</w:t>
+      </w:r>
+    </w:p>
+    <w:p>
+      <w:r>
+        <w:t xml:space="preserve">    </w:t>
+      </w:r>
+      <w:proofErr w:type="spellStart"/>
+      <w:r>
+        <w:rPr>
+          <w:i/>
+          <w:iCs/>
+        </w:rPr>
+        <w:t>const</w:t>
+      </w:r>
+      <w:proofErr w:type="spellEnd"/>
+      <w:r>
+        <w:t xml:space="preserve"> </w:t>
+      </w:r>
+      <w:proofErr w:type="spellStart"/>
+      <w:r>
+        <w:t>valoresSensorUmidade</w:t>
+      </w:r>
+      <w:proofErr w:type="spellEnd"/>
+      <w:r>
+        <w:t xml:space="preserve"> = [];</w:t>
+      </w:r>
+    </w:p>
+    <w:p>
+      <w:r>
+        <w:t xml:space="preserve">    </w:t>
+      </w:r>
+      <w:proofErr w:type="spellStart"/>
+      <w:r>
+        <w:rPr>
+          <w:i/>
+          <w:iCs/>
+        </w:rPr>
+        <w:t>const</w:t>
+      </w:r>
+      <w:proofErr w:type="spellEnd"/>
+      <w:r>
+        <w:t xml:space="preserve"> </w:t>
+      </w:r>
+      <w:proofErr w:type="spellStart"/>
+      <w:r>
+        <w:t>valoresSensorTemperatura</w:t>
+      </w:r>
+      <w:proofErr w:type="spellEnd"/>
+      <w:r>
+        <w:t xml:space="preserve"> = [];</w:t>
+      </w:r>
+    </w:p>
+    <w:p/>
+    <w:p>
+      <w:r>
+        <w:t>    // inicia a comunicação serial</w:t>
+      </w:r>
+    </w:p>
+    <w:p>
+      <w:r>
+        <w:t xml:space="preserve">    </w:t>
+      </w:r>
+      <w:proofErr w:type="spellStart"/>
+      <w:r>
+        <w:t>await</w:t>
+      </w:r>
+      <w:proofErr w:type="spellEnd"/>
+      <w:r>
+        <w:t xml:space="preserve"> </w:t>
+      </w:r>
+      <w:proofErr w:type="gramStart"/>
+      <w:r>
+        <w:t>serial(</w:t>
+      </w:r>
+      <w:proofErr w:type="gramEnd"/>
+    </w:p>
+    <w:p>
+      <w:r>
+        <w:t xml:space="preserve">        </w:t>
+      </w:r>
+      <w:proofErr w:type="spellStart"/>
+      <w:r>
+        <w:t>valoresSensorUmidade</w:t>
+      </w:r>
+      <w:proofErr w:type="spellEnd"/>
+      <w:r>
+        <w:t>,</w:t>
+      </w:r>
+    </w:p>
+    <w:p>
+      <w:r>
+        <w:t xml:space="preserve">        </w:t>
+      </w:r>
+      <w:proofErr w:type="spellStart"/>
+      <w:r>
+        <w:t>valoresSensorTemperatura</w:t>
+      </w:r>
+      <w:proofErr w:type="spellEnd"/>
+    </w:p>
+    <w:p>
+      <w:r>
+        <w:t>    );</w:t>
+      </w:r>
+    </w:p>
+    <w:p/>
+    <w:p>
+      <w:r>
+        <w:t>    // inicia o servidor web</w:t>
+      </w:r>
+    </w:p>
+    <w:p>
+      <w:r>
+        <w:t xml:space="preserve">    </w:t>
+      </w:r>
+      <w:proofErr w:type="gramStart"/>
+      <w:r>
+        <w:t>servidor(</w:t>
+      </w:r>
+      <w:proofErr w:type="gramEnd"/>
+    </w:p>
+    <w:p>
+      <w:r>
+        <w:t xml:space="preserve">        </w:t>
+      </w:r>
+      <w:proofErr w:type="spellStart"/>
+      <w:r>
+        <w:t>valoresSensorUmidade</w:t>
+      </w:r>
+      <w:proofErr w:type="spellEnd"/>
+      <w:r>
+        <w:t>,</w:t>
+      </w:r>
+    </w:p>
+    <w:p>
+      <w:r>
+        <w:t xml:space="preserve">        </w:t>
+      </w:r>
+      <w:proofErr w:type="spellStart"/>
+      <w:r>
+        <w:t>valoresSensorTemperatura</w:t>
+      </w:r>
+      <w:proofErr w:type="spellEnd"/>
+    </w:p>
+    <w:p>
+      <w:r>
+        <w:t>    );</w:t>
+      </w:r>
+    </w:p>
+    <w:p>
+      <w:r>
+        <w:t>})();</w:t>
+      </w:r>
+    </w:p>
     <w:p/>
     <w:p/>
     <w:p/>
@@ -4148,149 +6162,6 @@
                     <a:xfrm>
                       <a:off x="0" y="0"/>
                       <a:ext cx="6638924" cy="3324225"/>
-                    </a:xfrm>
-                    <a:prstGeom prst="rect">
-                      <a:avLst/>
-                    </a:prstGeom>
-                  </pic:spPr>
-                </pic:pic>
-              </a:graphicData>
-            </a:graphic>
-          </wp:inline>
-        </w:drawing>
-      </w:r>
-    </w:p>
-    <w:p>
-      <w:pPr>
-        <w:rPr>
-          <w:sz w:val="28"/>
-          <w:szCs w:val="28"/>
-        </w:rPr>
-      </w:pPr>
-    </w:p>
-    <w:p>
-      <w:pPr>
-        <w:pStyle w:val="PargrafodaLista"/>
-      </w:pPr>
-      <w:r>
-        <w:drawing>
-          <wp:inline distT="0" distB="0" distL="0" distR="0" wp14:anchorId="588DE561" wp14:editId="15CDB56D">
-            <wp:extent cx="6645910" cy="5400675"/>
-            <wp:effectExtent l="0" t="0" r="2540" b="9525"/>
-            <wp:docPr id="962628319" name="Imagem 1"/>
-            <wp:cNvGraphicFramePr>
-              <a:graphicFrameLocks xmlns:a="http://schemas.openxmlformats.org/drawingml/2006/main" noChangeAspect="1"/>
-            </wp:cNvGraphicFramePr>
-            <a:graphic xmlns:a="http://schemas.openxmlformats.org/drawingml/2006/main">
-              <a:graphicData uri="http://schemas.openxmlformats.org/drawingml/2006/picture">
-                <pic:pic xmlns:pic="http://schemas.openxmlformats.org/drawingml/2006/picture">
-                  <pic:nvPicPr>
-                    <pic:cNvPr id="962628319" name=""/>
-                    <pic:cNvPicPr/>
-                  </pic:nvPicPr>
-                  <pic:blipFill>
-                    <a:blip r:embed="rId22"/>
-                    <a:stretch>
-                      <a:fillRect/>
-                    </a:stretch>
-                  </pic:blipFill>
-                  <pic:spPr>
-                    <a:xfrm>
-                      <a:off x="0" y="0"/>
-                      <a:ext cx="6645910" cy="5400675"/>
-                    </a:xfrm>
-                    <a:prstGeom prst="rect">
-                      <a:avLst/>
-                    </a:prstGeom>
-                  </pic:spPr>
-                </pic:pic>
-              </a:graphicData>
-            </a:graphic>
-          </wp:inline>
-        </w:drawing>
-      </w:r>
-    </w:p>
-    <w:p>
-      <w:pPr>
-        <w:pStyle w:val="PargrafodaLista"/>
-        <w:numPr>
-          <w:ilvl w:val="0"/>
-          <w:numId w:val="8"/>
-        </w:numPr>
-      </w:pPr>
-      <w:r>
-        <w:lastRenderedPageBreak/>
-        <w:drawing>
-          <wp:inline distT="0" distB="0" distL="0" distR="0" wp14:anchorId="58AD9312" wp14:editId="7B4BF372">
-            <wp:extent cx="6645910" cy="2419985"/>
-            <wp:effectExtent l="0" t="0" r="2540" b="0"/>
-            <wp:docPr id="760402354" name="Imagem 1"/>
-            <wp:cNvGraphicFramePr>
-              <a:graphicFrameLocks xmlns:a="http://schemas.openxmlformats.org/drawingml/2006/main" noChangeAspect="1"/>
-            </wp:cNvGraphicFramePr>
-            <a:graphic xmlns:a="http://schemas.openxmlformats.org/drawingml/2006/main">
-              <a:graphicData uri="http://schemas.openxmlformats.org/drawingml/2006/picture">
-                <pic:pic xmlns:pic="http://schemas.openxmlformats.org/drawingml/2006/picture">
-                  <pic:nvPicPr>
-                    <pic:cNvPr id="760402354" name=""/>
-                    <pic:cNvPicPr/>
-                  </pic:nvPicPr>
-                  <pic:blipFill>
-                    <a:blip r:embed="rId23"/>
-                    <a:stretch>
-                      <a:fillRect/>
-                    </a:stretch>
-                  </pic:blipFill>
-                  <pic:spPr>
-                    <a:xfrm>
-                      <a:off x="0" y="0"/>
-                      <a:ext cx="6645910" cy="2419985"/>
-                    </a:xfrm>
-                    <a:prstGeom prst="rect">
-                      <a:avLst/>
-                    </a:prstGeom>
-                  </pic:spPr>
-                </pic:pic>
-              </a:graphicData>
-            </a:graphic>
-          </wp:inline>
-        </w:drawing>
-      </w:r>
-    </w:p>
-    <w:p>
-      <w:pPr>
-        <w:pStyle w:val="PargrafodaLista"/>
-        <w:numPr>
-          <w:ilvl w:val="0"/>
-          <w:numId w:val="8"/>
-        </w:numPr>
-      </w:pPr>
-      <w:r>
-        <w:drawing>
-          <wp:inline distT="0" distB="0" distL="0" distR="0" wp14:anchorId="1E94BE1A" wp14:editId="1CF216CC">
-            <wp:extent cx="6645910" cy="2447290"/>
-            <wp:effectExtent l="0" t="0" r="2540" b="0"/>
-            <wp:docPr id="458638555" name="Imagem 1"/>
-            <wp:cNvGraphicFramePr>
-              <a:graphicFrameLocks xmlns:a="http://schemas.openxmlformats.org/drawingml/2006/main" noChangeAspect="1"/>
-            </wp:cNvGraphicFramePr>
-            <a:graphic xmlns:a="http://schemas.openxmlformats.org/drawingml/2006/main">
-              <a:graphicData uri="http://schemas.openxmlformats.org/drawingml/2006/picture">
-                <pic:pic xmlns:pic="http://schemas.openxmlformats.org/drawingml/2006/picture">
-                  <pic:nvPicPr>
-                    <pic:cNvPr id="458638555" name=""/>
-                    <pic:cNvPicPr/>
-                  </pic:nvPicPr>
-                  <pic:blipFill>
-                    <a:blip r:embed="rId24"/>
-                    <a:stretch>
-                      <a:fillRect/>
-                    </a:stretch>
-                  </pic:blipFill>
-                  <pic:spPr>
-                    <a:xfrm>
-                      <a:off x="0" y="0"/>
-                      <a:ext cx="6645910" cy="2447290"/>
                     </a:xfrm>
                     <a:prstGeom prst="rect">
                       <a:avLst/>
@@ -5505,7 +7376,6 @@
   <w:style w:type="character" w:default="1" w:styleId="Fontepargpadro">
     <w:name w:val="Default Paragraph Font"/>
     <w:uiPriority w:val="1"/>
-    <w:semiHidden/>
     <w:unhideWhenUsed/>
   </w:style>
   <w:style w:type="table" w:default="1" w:styleId="Tabelanormal">
@@ -6401,8 +8271,14 @@
 <file path=customXml/itemProps3.xml><?xml version="1.0" encoding="utf-8"?>
 <ds:datastoreItem xmlns:ds="http://schemas.openxmlformats.org/officeDocument/2006/customXml" ds:itemID="{9DAB58E4-4D3A-4AA7-B901-A5D4DBBD037C}">
   <ds:schemaRefs>
+    <ds:schemaRef ds:uri="http://purl.org/dc/terms/"/>
+    <ds:schemaRef ds:uri="http://purl.org/dc/elements/1.1/"/>
+    <ds:schemaRef ds:uri="http://purl.org/dc/dcmitype/"/>
+    <ds:schemaRef ds:uri="http://schemas.microsoft.com/office/infopath/2007/PartnerControls"/>
+    <ds:schemaRef ds:uri="http://schemas.microsoft.com/office/2006/documentManagement/types"/>
+    <ds:schemaRef ds:uri="http://schemas.openxmlformats.org/package/2006/metadata/core-properties"/>
+    <ds:schemaRef ds:uri="http://www.w3.org/XML/1998/namespace"/>
     <ds:schemaRef ds:uri="http://schemas.microsoft.com/office/2006/metadata/properties"/>
-    <ds:schemaRef ds:uri="http://schemas.microsoft.com/office/infopath/2007/PartnerControls"/>
     <ds:schemaRef ds:uri="1dc861b8-2196-455d-b291-a999da8cffb6"/>
   </ds:schemaRefs>
 </ds:datastoreItem>

</xml_diff>

<commit_message>
Readme da API alterado, deixando os direitos autorais da faculdde
</commit_message>
<xml_diff>
--- a/Documentação/Documentação do Projeto/PROJETO COGUMELO.docx
+++ b/Documentação/Documentação do Projeto/PROJETO COGUMELO.docx
@@ -363,14 +363,12 @@
       <w:r>
         <w:t xml:space="preserve"> por </w:t>
       </w:r>
-      <w:proofErr w:type="gramStart"/>
       <w:r>
         <w:t xml:space="preserve">exemplo, </w:t>
       </w:r>
       <w:r>
-        <w:t xml:space="preserve"> o</w:t>
-      </w:r>
-      <w:proofErr w:type="gramEnd"/>
+        <w:t>o</w:t>
+      </w:r>
       <w:r>
         <w:t xml:space="preserve"> usavam como presente especial para o deus Osíris</w:t>
       </w:r>
@@ -659,7 +657,7 @@
           <w:noProof/>
         </w:rPr>
         <w:drawing>
-          <wp:inline distT="0" distB="0" distL="0" distR="0" wp14:anchorId="6C65991C" wp14:editId="7DF0D7BD">
+          <wp:inline distT="0" distB="0" distL="0" distR="0" wp14:anchorId="6C65991C" wp14:editId="4BEB1FEA">
             <wp:extent cx="2092147" cy="1827053"/>
             <wp:effectExtent l="0" t="0" r="3810" b="1905"/>
             <wp:docPr id="806639724" name="Imagem 1" descr="Diagrama&#10;&#10;O conteúdo gerado por IA pode estar incorreto."/>
@@ -3984,15 +3982,7 @@
     <w:p/>
     <w:p>
       <w:r>
-        <w:t xml:space="preserve">// importa </w:t>
-      </w:r>
-      <w:proofErr w:type="gramStart"/>
-      <w:r>
-        <w:t>os bibliotecas</w:t>
-      </w:r>
-      <w:proofErr w:type="gramEnd"/>
-      <w:r>
-        <w:t xml:space="preserve"> necessários</w:t>
+        <w:t>// importa os bibliotecas necessários</w:t>
       </w:r>
     </w:p>
     <w:p>
@@ -4247,12 +4237,10 @@
         <w:t xml:space="preserve"> = </w:t>
       </w:r>
       <w:proofErr w:type="spellStart"/>
-      <w:proofErr w:type="gramStart"/>
       <w:r>
         <w:t>mysql.createPool</w:t>
       </w:r>
       <w:proofErr w:type="spellEnd"/>
-      <w:proofErr w:type="gramEnd"/>
       <w:r>
         <w:t>(</w:t>
       </w:r>
@@ -4343,26 +4331,192 @@
     </w:p>
     <w:p>
       <w:r>
+        <w:t>    ).</w:t>
+      </w:r>
+      <w:proofErr w:type="spellStart"/>
+      <w:r>
+        <w:t>promise</w:t>
+      </w:r>
+      <w:proofErr w:type="spellEnd"/>
+      <w:r>
+        <w:t>();</w:t>
+      </w:r>
+    </w:p>
+    <w:p/>
+    <w:p>
+      <w:r>
+        <w:t>    // lista as portas seriais disponíveis e procura pelo Arduino</w:t>
+      </w:r>
+    </w:p>
+    <w:p>
+      <w:r>
         <w:t xml:space="preserve">    </w:t>
       </w:r>
-      <w:proofErr w:type="gramStart"/>
-      <w:r>
-        <w:t>).</w:t>
-      </w:r>
-      <w:proofErr w:type="spellStart"/>
-      <w:r>
-        <w:t>promise</w:t>
-      </w:r>
-      <w:proofErr w:type="spellEnd"/>
-      <w:proofErr w:type="gramEnd"/>
+      <w:proofErr w:type="spellStart"/>
+      <w:r>
+        <w:rPr>
+          <w:i/>
+          <w:iCs/>
+        </w:rPr>
+        <w:t>const</w:t>
+      </w:r>
+      <w:proofErr w:type="spellEnd"/>
+      <w:r>
+        <w:t xml:space="preserve"> portas = </w:t>
+      </w:r>
+      <w:proofErr w:type="spellStart"/>
+      <w:r>
+        <w:t>await</w:t>
+      </w:r>
+      <w:proofErr w:type="spellEnd"/>
+      <w:r>
+        <w:t xml:space="preserve"> </w:t>
+      </w:r>
+      <w:proofErr w:type="spellStart"/>
+      <w:r>
+        <w:t>serialport.SerialPort.list</w:t>
+      </w:r>
+      <w:proofErr w:type="spellEnd"/>
       <w:r>
         <w:t>();</w:t>
       </w:r>
     </w:p>
+    <w:p>
+      <w:r>
+        <w:t xml:space="preserve">    </w:t>
+      </w:r>
+      <w:proofErr w:type="spellStart"/>
+      <w:r>
+        <w:rPr>
+          <w:i/>
+          <w:iCs/>
+        </w:rPr>
+        <w:t>const</w:t>
+      </w:r>
+      <w:proofErr w:type="spellEnd"/>
+      <w:r>
+        <w:t xml:space="preserve"> </w:t>
+      </w:r>
+      <w:proofErr w:type="spellStart"/>
+      <w:r>
+        <w:t>portaArduino</w:t>
+      </w:r>
+      <w:proofErr w:type="spellEnd"/>
+      <w:r>
+        <w:t xml:space="preserve"> = </w:t>
+      </w:r>
+      <w:proofErr w:type="spellStart"/>
+      <w:r>
+        <w:t>portas.find</w:t>
+      </w:r>
+      <w:proofErr w:type="spellEnd"/>
+      <w:r>
+        <w:t>((</w:t>
+      </w:r>
+      <w:r>
+        <w:rPr>
+          <w:i/>
+          <w:iCs/>
+        </w:rPr>
+        <w:t>porta</w:t>
+      </w:r>
+      <w:r>
+        <w:t xml:space="preserve">) </w:t>
+      </w:r>
+      <w:r>
+        <w:rPr>
+          <w:i/>
+          <w:iCs/>
+        </w:rPr>
+        <w:t>=&gt;</w:t>
+      </w:r>
+      <w:r>
+        <w:t xml:space="preserve"> </w:t>
+      </w:r>
+      <w:proofErr w:type="spellStart"/>
+      <w:r>
+        <w:t>porta.vendorId</w:t>
+      </w:r>
+      <w:proofErr w:type="spellEnd"/>
+      <w:r>
+        <w:t xml:space="preserve"> == 2341 &amp;&amp; </w:t>
+      </w:r>
+      <w:proofErr w:type="spellStart"/>
+      <w:r>
+        <w:t>porta.productId</w:t>
+      </w:r>
+      <w:proofErr w:type="spellEnd"/>
+      <w:r>
+        <w:t xml:space="preserve"> == 43);</w:t>
+      </w:r>
+    </w:p>
+    <w:p>
+      <w:r>
+        <w:t xml:space="preserve">    </w:t>
+      </w:r>
+      <w:proofErr w:type="spellStart"/>
+      <w:r>
+        <w:t>if</w:t>
+      </w:r>
+      <w:proofErr w:type="spellEnd"/>
+      <w:r>
+        <w:t xml:space="preserve"> (!</w:t>
+      </w:r>
+      <w:proofErr w:type="spellStart"/>
+      <w:r>
+        <w:t>portaArduino</w:t>
+      </w:r>
+      <w:proofErr w:type="spellEnd"/>
+      <w:r>
+        <w:t>) {</w:t>
+      </w:r>
+    </w:p>
+    <w:p>
+      <w:r>
+        <w:t xml:space="preserve">        </w:t>
+      </w:r>
+      <w:proofErr w:type="spellStart"/>
+      <w:r>
+        <w:t>throw</w:t>
+      </w:r>
+      <w:proofErr w:type="spellEnd"/>
+      <w:r>
+        <w:t xml:space="preserve"> new </w:t>
+      </w:r>
+      <w:proofErr w:type="spellStart"/>
+      <w:r>
+        <w:t>Error</w:t>
+      </w:r>
+      <w:proofErr w:type="spellEnd"/>
+      <w:r>
+        <w:t xml:space="preserve">('O </w:t>
+      </w:r>
+      <w:proofErr w:type="spellStart"/>
+      <w:r>
+        <w:t>arduino</w:t>
+      </w:r>
+      <w:proofErr w:type="spellEnd"/>
+      <w:r>
+        <w:t xml:space="preserve"> não foi encontrado em nenhuma porta serial');</w:t>
+      </w:r>
+    </w:p>
+    <w:p>
+      <w:r>
+        <w:t>    }</w:t>
+      </w:r>
+    </w:p>
     <w:p/>
     <w:p>
       <w:r>
-        <w:t>    // lista as portas seriais disponíveis e procura pelo Arduino</w:t>
+        <w:t xml:space="preserve">    // configura a porta serial com o </w:t>
+      </w:r>
+      <w:proofErr w:type="spellStart"/>
+      <w:r>
+        <w:t>baud</w:t>
+      </w:r>
+      <w:proofErr w:type="spellEnd"/>
+      <w:r>
+        <w:t xml:space="preserve"> rate especificado</w:t>
       </w:r>
     </w:p>
     <w:p>
@@ -4379,25 +4533,70 @@
       </w:r>
       <w:proofErr w:type="spellEnd"/>
       <w:r>
-        <w:t xml:space="preserve"> portas = </w:t>
-      </w:r>
-      <w:proofErr w:type="spellStart"/>
-      <w:r>
-        <w:t>await</w:t>
-      </w:r>
-      <w:proofErr w:type="spellEnd"/>
-      <w:r>
         <w:t xml:space="preserve"> </w:t>
       </w:r>
       <w:proofErr w:type="spellStart"/>
-      <w:proofErr w:type="gramStart"/>
-      <w:r>
-        <w:t>serialport.SerialPort.list</w:t>
-      </w:r>
-      <w:proofErr w:type="spellEnd"/>
-      <w:proofErr w:type="gramEnd"/>
-      <w:r>
-        <w:t>();</w:t>
+      <w:r>
+        <w:t>arduino</w:t>
+      </w:r>
+      <w:proofErr w:type="spellEnd"/>
+      <w:r>
+        <w:t xml:space="preserve"> = new </w:t>
+      </w:r>
+      <w:proofErr w:type="spellStart"/>
+      <w:r>
+        <w:t>serialport.SerialPort</w:t>
+      </w:r>
+      <w:proofErr w:type="spellEnd"/>
+      <w:r>
+        <w:t>(</w:t>
+      </w:r>
+    </w:p>
+    <w:p>
+      <w:r>
+        <w:t>        {</w:t>
+      </w:r>
+    </w:p>
+    <w:p>
+      <w:r>
+        <w:t xml:space="preserve">            path: </w:t>
+      </w:r>
+      <w:proofErr w:type="spellStart"/>
+      <w:r>
+        <w:t>portaArduino.path</w:t>
+      </w:r>
+      <w:proofErr w:type="spellEnd"/>
+      <w:r>
+        <w:t>,</w:t>
+      </w:r>
+    </w:p>
+    <w:p>
+      <w:r>
+        <w:t xml:space="preserve">            </w:t>
+      </w:r>
+      <w:proofErr w:type="spellStart"/>
+      <w:r>
+        <w:t>baudRate</w:t>
+      </w:r>
+      <w:proofErr w:type="spellEnd"/>
+      <w:r>
+        <w:t>: SERIAL_BAUD_RATE</w:t>
+      </w:r>
+    </w:p>
+    <w:p>
+      <w:r>
+        <w:t>        }</w:t>
+      </w:r>
+    </w:p>
+    <w:p>
+      <w:r>
+        <w:t>    );</w:t>
+      </w:r>
+    </w:p>
+    <w:p/>
+    <w:p>
+      <w:r>
+        <w:t>    // evento quando a porta serial é aberta</w:t>
       </w:r>
     </w:p>
     <w:p>
@@ -4406,419 +4605,154 @@
       </w:r>
       <w:proofErr w:type="spellStart"/>
       <w:r>
+        <w:t>arduino.on</w:t>
+      </w:r>
+      <w:proofErr w:type="spellEnd"/>
+      <w:r>
+        <w:t xml:space="preserve">('open', () </w:t>
+      </w:r>
+      <w:r>
         <w:rPr>
           <w:i/>
           <w:iCs/>
         </w:rPr>
+        <w:t>=&gt;</w:t>
+      </w:r>
+      <w:r>
+        <w:t xml:space="preserve"> {</w:t>
+      </w:r>
+    </w:p>
+    <w:p>
+      <w:r>
+        <w:t xml:space="preserve">        console.log(`A leitura do </w:t>
+      </w:r>
+      <w:proofErr w:type="spellStart"/>
+      <w:r>
+        <w:t>arduino</w:t>
+      </w:r>
+      <w:proofErr w:type="spellEnd"/>
+      <w:r>
+        <w:t xml:space="preserve"> foi iniciada na porta ${</w:t>
+      </w:r>
+      <w:proofErr w:type="spellStart"/>
+      <w:r>
+        <w:t>portaArduino.path</w:t>
+      </w:r>
+      <w:proofErr w:type="spellEnd"/>
+      <w:r>
+        <w:t xml:space="preserve">} utilizando </w:t>
+      </w:r>
+      <w:proofErr w:type="spellStart"/>
+      <w:r>
+        <w:t>Baud</w:t>
+      </w:r>
+      <w:proofErr w:type="spellEnd"/>
+      <w:r>
+        <w:t xml:space="preserve"> Rate de ${SERIAL_BAUD_RATE}`);</w:t>
+      </w:r>
+    </w:p>
+    <w:p>
+      <w:r>
+        <w:t>    });</w:t>
+      </w:r>
+    </w:p>
+    <w:p/>
+    <w:p>
+      <w:r>
+        <w:t>    // processa os dados recebidos do Arduino</w:t>
+      </w:r>
+    </w:p>
+    <w:p>
+      <w:r>
+        <w:t xml:space="preserve">    </w:t>
+      </w:r>
+      <w:proofErr w:type="spellStart"/>
+      <w:r>
+        <w:t>arduino.pipe</w:t>
+      </w:r>
+      <w:proofErr w:type="spellEnd"/>
+      <w:r>
+        <w:t xml:space="preserve">(new </w:t>
+      </w:r>
+      <w:proofErr w:type="spellStart"/>
+      <w:r>
+        <w:t>serialport.ReadlineParser</w:t>
+      </w:r>
+      <w:proofErr w:type="spellEnd"/>
+      <w:r>
+        <w:t xml:space="preserve">({ </w:t>
+      </w:r>
+      <w:proofErr w:type="spellStart"/>
+      <w:r>
+        <w:t>delimiter</w:t>
+      </w:r>
+      <w:proofErr w:type="spellEnd"/>
+      <w:r>
+        <w:t>: '\r\n' })).</w:t>
+      </w:r>
+      <w:proofErr w:type="spellStart"/>
+      <w:r>
+        <w:t>on</w:t>
+      </w:r>
+      <w:proofErr w:type="spellEnd"/>
+      <w:r>
+        <w:t xml:space="preserve">('data', </w:t>
+      </w:r>
+      <w:proofErr w:type="spellStart"/>
+      <w:r>
+        <w:t>async</w:t>
+      </w:r>
+      <w:proofErr w:type="spellEnd"/>
+      <w:r>
+        <w:t xml:space="preserve"> (</w:t>
+      </w:r>
+      <w:r>
+        <w:rPr>
+          <w:i/>
+          <w:iCs/>
+        </w:rPr>
+        <w:t>data</w:t>
+      </w:r>
+      <w:r>
+        <w:t xml:space="preserve">) </w:t>
+      </w:r>
+      <w:r>
+        <w:rPr>
+          <w:i/>
+          <w:iCs/>
+        </w:rPr>
+        <w:t>=&gt;</w:t>
+      </w:r>
+      <w:r>
+        <w:t xml:space="preserve"> {</w:t>
+      </w:r>
+    </w:p>
+    <w:p>
+      <w:r>
+        <w:t>        //console.log(data);</w:t>
+      </w:r>
+    </w:p>
+    <w:p>
+      <w:r>
+        <w:t xml:space="preserve">        </w:t>
+      </w:r>
+      <w:proofErr w:type="spellStart"/>
+      <w:r>
+        <w:rPr>
+          <w:i/>
+          <w:iCs/>
+        </w:rPr>
         <w:t>const</w:t>
       </w:r>
       <w:proofErr w:type="spellEnd"/>
       <w:r>
-        <w:t xml:space="preserve"> </w:t>
-      </w:r>
-      <w:proofErr w:type="spellStart"/>
-      <w:r>
-        <w:t>portaArduino</w:t>
-      </w:r>
-      <w:proofErr w:type="spellEnd"/>
-      <w:r>
-        <w:t xml:space="preserve"> = </w:t>
-      </w:r>
-      <w:proofErr w:type="spellStart"/>
-      <w:proofErr w:type="gramStart"/>
-      <w:r>
-        <w:t>portas.find</w:t>
-      </w:r>
-      <w:proofErr w:type="spellEnd"/>
-      <w:proofErr w:type="gramEnd"/>
-      <w:r>
-        <w:t>((</w:t>
-      </w:r>
-      <w:r>
-        <w:rPr>
-          <w:i/>
-          <w:iCs/>
-        </w:rPr>
-        <w:t>porta</w:t>
-      </w:r>
-      <w:r>
-        <w:t xml:space="preserve">) </w:t>
-      </w:r>
-      <w:r>
-        <w:rPr>
-          <w:i/>
-          <w:iCs/>
-        </w:rPr>
-        <w:t>=&gt;</w:t>
-      </w:r>
-      <w:r>
-        <w:t xml:space="preserve"> </w:t>
-      </w:r>
-      <w:proofErr w:type="spellStart"/>
-      <w:proofErr w:type="gramStart"/>
-      <w:r>
-        <w:t>porta.vendorId</w:t>
-      </w:r>
-      <w:proofErr w:type="spellEnd"/>
-      <w:proofErr w:type="gramEnd"/>
-      <w:r>
-        <w:t xml:space="preserve"> == 2341 &amp;&amp; </w:t>
-      </w:r>
-      <w:proofErr w:type="spellStart"/>
-      <w:proofErr w:type="gramStart"/>
-      <w:r>
-        <w:t>porta.productId</w:t>
-      </w:r>
-      <w:proofErr w:type="spellEnd"/>
-      <w:proofErr w:type="gramEnd"/>
-      <w:r>
-        <w:t xml:space="preserve"> == 43);</w:t>
-      </w:r>
-    </w:p>
-    <w:p>
-      <w:r>
-        <w:t xml:space="preserve">    </w:t>
-      </w:r>
-      <w:proofErr w:type="spellStart"/>
-      <w:r>
-        <w:t>if</w:t>
-      </w:r>
-      <w:proofErr w:type="spellEnd"/>
-      <w:r>
-        <w:t xml:space="preserve"> </w:t>
-      </w:r>
-      <w:proofErr w:type="gramStart"/>
-      <w:r>
-        <w:t>(!</w:t>
-      </w:r>
-      <w:proofErr w:type="spellStart"/>
-      <w:r>
-        <w:t>portaArduino</w:t>
-      </w:r>
-      <w:proofErr w:type="spellEnd"/>
-      <w:proofErr w:type="gramEnd"/>
-      <w:r>
-        <w:t>) {</w:t>
-      </w:r>
-    </w:p>
-    <w:p>
-      <w:r>
-        <w:t xml:space="preserve">        </w:t>
-      </w:r>
-      <w:proofErr w:type="spellStart"/>
-      <w:r>
-        <w:t>throw</w:t>
-      </w:r>
-      <w:proofErr w:type="spellEnd"/>
-      <w:r>
-        <w:t xml:space="preserve"> new </w:t>
-      </w:r>
-      <w:proofErr w:type="spellStart"/>
-      <w:proofErr w:type="gramStart"/>
-      <w:r>
-        <w:t>Error</w:t>
-      </w:r>
-      <w:proofErr w:type="spellEnd"/>
-      <w:r>
-        <w:t>(</w:t>
-      </w:r>
-      <w:proofErr w:type="gramEnd"/>
-      <w:r>
-        <w:t xml:space="preserve">'O </w:t>
-      </w:r>
-      <w:proofErr w:type="spellStart"/>
-      <w:r>
-        <w:t>arduino</w:t>
-      </w:r>
-      <w:proofErr w:type="spellEnd"/>
-      <w:r>
-        <w:t xml:space="preserve"> não foi encontrado em nenhuma porta serial');</w:t>
-      </w:r>
-    </w:p>
-    <w:p>
-      <w:r>
-        <w:t>    }</w:t>
-      </w:r>
-    </w:p>
-    <w:p/>
-    <w:p>
-      <w:r>
-        <w:t xml:space="preserve">    // configura a porta serial com o </w:t>
-      </w:r>
-      <w:proofErr w:type="spellStart"/>
-      <w:r>
-        <w:t>baud</w:t>
-      </w:r>
-      <w:proofErr w:type="spellEnd"/>
-      <w:r>
-        <w:t xml:space="preserve"> rate especificado</w:t>
-      </w:r>
-    </w:p>
-    <w:p>
-      <w:r>
-        <w:t xml:space="preserve">    </w:t>
-      </w:r>
-      <w:proofErr w:type="spellStart"/>
-      <w:r>
-        <w:rPr>
-          <w:i/>
-          <w:iCs/>
-        </w:rPr>
-        <w:t>const</w:t>
-      </w:r>
-      <w:proofErr w:type="spellEnd"/>
-      <w:r>
-        <w:t xml:space="preserve"> </w:t>
-      </w:r>
-      <w:proofErr w:type="spellStart"/>
-      <w:r>
-        <w:t>arduino</w:t>
-      </w:r>
-      <w:proofErr w:type="spellEnd"/>
-      <w:r>
-        <w:t xml:space="preserve"> = new </w:t>
-      </w:r>
-      <w:proofErr w:type="spellStart"/>
-      <w:proofErr w:type="gramStart"/>
-      <w:r>
-        <w:t>serialport.SerialPort</w:t>
-      </w:r>
-      <w:proofErr w:type="spellEnd"/>
-      <w:proofErr w:type="gramEnd"/>
-      <w:r>
-        <w:t>(</w:t>
-      </w:r>
-    </w:p>
-    <w:p>
-      <w:r>
-        <w:t>        {</w:t>
-      </w:r>
-    </w:p>
-    <w:p>
-      <w:r>
-        <w:t xml:space="preserve">            path: </w:t>
-      </w:r>
-      <w:proofErr w:type="spellStart"/>
-      <w:r>
-        <w:t>portaArduino.path</w:t>
-      </w:r>
-      <w:proofErr w:type="spellEnd"/>
-      <w:r>
-        <w:t>,</w:t>
-      </w:r>
-    </w:p>
-    <w:p>
-      <w:r>
-        <w:t xml:space="preserve">            </w:t>
-      </w:r>
-      <w:proofErr w:type="spellStart"/>
-      <w:r>
-        <w:t>baudRate</w:t>
-      </w:r>
-      <w:proofErr w:type="spellEnd"/>
-      <w:r>
-        <w:t>: SERIAL_BAUD_RATE</w:t>
-      </w:r>
-    </w:p>
-    <w:p>
-      <w:r>
-        <w:t>        }</w:t>
-      </w:r>
-    </w:p>
-    <w:p>
-      <w:r>
-        <w:t>    );</w:t>
-      </w:r>
-    </w:p>
-    <w:p/>
-    <w:p>
-      <w:r>
-        <w:t>    // evento quando a porta serial é aberta</w:t>
-      </w:r>
-    </w:p>
-    <w:p>
-      <w:r>
-        <w:t xml:space="preserve">    </w:t>
-      </w:r>
-      <w:proofErr w:type="spellStart"/>
-      <w:proofErr w:type="gramStart"/>
-      <w:r>
-        <w:t>arduino.on</w:t>
-      </w:r>
-      <w:proofErr w:type="spellEnd"/>
-      <w:proofErr w:type="gramEnd"/>
-      <w:r>
-        <w:t xml:space="preserve">('open', () </w:t>
-      </w:r>
-      <w:r>
-        <w:rPr>
-          <w:i/>
-          <w:iCs/>
-        </w:rPr>
-        <w:t>=&gt;</w:t>
-      </w:r>
-      <w:r>
-        <w:t xml:space="preserve"> {</w:t>
-      </w:r>
-    </w:p>
-    <w:p>
-      <w:r>
-        <w:t xml:space="preserve">        </w:t>
-      </w:r>
-      <w:proofErr w:type="gramStart"/>
-      <w:r>
-        <w:t>console.log(</w:t>
-      </w:r>
-      <w:proofErr w:type="gramEnd"/>
-      <w:r>
-        <w:t xml:space="preserve">`A leitura do </w:t>
-      </w:r>
-      <w:proofErr w:type="spellStart"/>
-      <w:r>
-        <w:t>arduino</w:t>
-      </w:r>
-      <w:proofErr w:type="spellEnd"/>
-      <w:r>
-        <w:t xml:space="preserve"> foi iniciada na porta ${</w:t>
-      </w:r>
-      <w:proofErr w:type="spellStart"/>
-      <w:r>
-        <w:t>portaArduino.path</w:t>
-      </w:r>
-      <w:proofErr w:type="spellEnd"/>
-      <w:r>
-        <w:t xml:space="preserve">} utilizando </w:t>
-      </w:r>
-      <w:proofErr w:type="spellStart"/>
-      <w:r>
-        <w:t>Baud</w:t>
-      </w:r>
-      <w:proofErr w:type="spellEnd"/>
-      <w:r>
-        <w:t xml:space="preserve"> Rate de ${SERIAL_BAUD_</w:t>
-      </w:r>
-      <w:proofErr w:type="gramStart"/>
-      <w:r>
-        <w:t>RATE}`</w:t>
-      </w:r>
-      <w:proofErr w:type="gramEnd"/>
-      <w:r>
-        <w:t>);</w:t>
-      </w:r>
-    </w:p>
-    <w:p>
-      <w:r>
-        <w:t>    });</w:t>
-      </w:r>
-    </w:p>
-    <w:p/>
-    <w:p>
-      <w:r>
-        <w:t>    // processa os dados recebidos do Arduino</w:t>
-      </w:r>
-    </w:p>
-    <w:p>
-      <w:r>
-        <w:t xml:space="preserve">    </w:t>
-      </w:r>
-      <w:proofErr w:type="spellStart"/>
-      <w:proofErr w:type="gramStart"/>
-      <w:r>
-        <w:t>arduino.pipe</w:t>
-      </w:r>
-      <w:proofErr w:type="spellEnd"/>
-      <w:proofErr w:type="gramEnd"/>
-      <w:r>
-        <w:t xml:space="preserve">(new </w:t>
-      </w:r>
-      <w:proofErr w:type="spellStart"/>
-      <w:proofErr w:type="gramStart"/>
-      <w:r>
-        <w:t>serialport.ReadlineParser</w:t>
-      </w:r>
-      <w:proofErr w:type="spellEnd"/>
-      <w:r>
-        <w:t xml:space="preserve">({ </w:t>
-      </w:r>
-      <w:proofErr w:type="spellStart"/>
-      <w:r>
-        <w:t>delimiter</w:t>
-      </w:r>
-      <w:proofErr w:type="spellEnd"/>
-      <w:proofErr w:type="gramEnd"/>
-      <w:r>
-        <w:t>: '\r\n</w:t>
-      </w:r>
-      <w:proofErr w:type="gramStart"/>
-      <w:r>
-        <w:t>' })).</w:t>
-      </w:r>
-      <w:proofErr w:type="spellStart"/>
-      <w:r>
-        <w:t>on</w:t>
-      </w:r>
-      <w:proofErr w:type="spellEnd"/>
-      <w:proofErr w:type="gramEnd"/>
-      <w:r>
-        <w:t xml:space="preserve">('data', </w:t>
-      </w:r>
-      <w:proofErr w:type="spellStart"/>
-      <w:r>
-        <w:t>async</w:t>
-      </w:r>
-      <w:proofErr w:type="spellEnd"/>
-      <w:r>
-        <w:t xml:space="preserve"> (</w:t>
-      </w:r>
-      <w:r>
-        <w:rPr>
-          <w:i/>
-          <w:iCs/>
-        </w:rPr>
-        <w:t>data</w:t>
-      </w:r>
-      <w:r>
-        <w:t xml:space="preserve">) </w:t>
-      </w:r>
-      <w:r>
-        <w:rPr>
-          <w:i/>
-          <w:iCs/>
-        </w:rPr>
-        <w:t>=&gt;</w:t>
-      </w:r>
-      <w:r>
-        <w:t xml:space="preserve"> {</w:t>
-      </w:r>
-    </w:p>
-    <w:p>
-      <w:r>
-        <w:t>        //console.log(data);</w:t>
-      </w:r>
-    </w:p>
-    <w:p>
-      <w:r>
-        <w:t xml:space="preserve">        </w:t>
-      </w:r>
-      <w:proofErr w:type="spellStart"/>
-      <w:r>
-        <w:rPr>
-          <w:i/>
-          <w:iCs/>
-        </w:rPr>
-        <w:t>const</w:t>
-      </w:r>
-      <w:proofErr w:type="spellEnd"/>
-      <w:r>
         <w:t xml:space="preserve"> valores = </w:t>
       </w:r>
       <w:proofErr w:type="spellStart"/>
-      <w:proofErr w:type="gramStart"/>
       <w:r>
         <w:t>data.split</w:t>
       </w:r>
       <w:proofErr w:type="spellEnd"/>
-      <w:proofErr w:type="gramEnd"/>
       <w:r>
         <w:t>(';');</w:t>
       </w:r>
@@ -4851,54 +4785,898 @@
       </w:r>
       <w:proofErr w:type="spellEnd"/>
       <w:r>
+        <w:t>(valores[0]);</w:t>
+      </w:r>
+    </w:p>
+    <w:p>
+      <w:r>
+        <w:t xml:space="preserve">        </w:t>
+      </w:r>
+      <w:proofErr w:type="spellStart"/>
+      <w:r>
+        <w:rPr>
+          <w:i/>
+          <w:iCs/>
+        </w:rPr>
+        <w:t>const</w:t>
+      </w:r>
+      <w:proofErr w:type="spellEnd"/>
+      <w:r>
+        <w:t xml:space="preserve"> sensorDHT11 = </w:t>
+      </w:r>
+      <w:proofErr w:type="spellStart"/>
+      <w:r>
+        <w:t>parseFloat</w:t>
+      </w:r>
+      <w:proofErr w:type="spellEnd"/>
+      <w:r>
+        <w:t>(valores[1]);</w:t>
+      </w:r>
+    </w:p>
+    <w:p/>
+    <w:p>
+      <w:r>
+        <w:t xml:space="preserve">        // armazena os valores dos sensores nos </w:t>
+      </w:r>
+      <w:proofErr w:type="spellStart"/>
+      <w:r>
+        <w:t>arrays</w:t>
+      </w:r>
+      <w:proofErr w:type="spellEnd"/>
+      <w:r>
+        <w:t xml:space="preserve"> correspondentes</w:t>
+      </w:r>
+    </w:p>
+    <w:p>
+      <w:r>
+        <w:t xml:space="preserve">        </w:t>
+      </w:r>
+      <w:proofErr w:type="spellStart"/>
+      <w:r>
+        <w:t>valoresSensorUmidade.push</w:t>
+      </w:r>
+      <w:proofErr w:type="spellEnd"/>
+      <w:r>
+        <w:t>(sensorDHT11);</w:t>
+      </w:r>
+    </w:p>
+    <w:p>
+      <w:r>
+        <w:t xml:space="preserve">        </w:t>
+      </w:r>
+      <w:proofErr w:type="spellStart"/>
+      <w:r>
+        <w:t>valoresSensorTemperatura.push</w:t>
+      </w:r>
+      <w:proofErr w:type="spellEnd"/>
+      <w:r>
+        <w:t>(sensorLM35);</w:t>
+      </w:r>
+    </w:p>
+    <w:p/>
+    <w:p>
+      <w:r>
+        <w:t>        // insere os dados no banco de dados (se habilitado)</w:t>
+      </w:r>
+    </w:p>
+    <w:p>
+      <w:r>
+        <w:t xml:space="preserve">        </w:t>
+      </w:r>
+      <w:proofErr w:type="spellStart"/>
+      <w:r>
+        <w:t>if</w:t>
+      </w:r>
+      <w:proofErr w:type="spellEnd"/>
+      <w:r>
+        <w:t xml:space="preserve"> (HABILITAR_OPERACAO_INSERIR) {</w:t>
+      </w:r>
+    </w:p>
+    <w:p>
+      <w:r>
+        <w:t xml:space="preserve">            console.log("valores inseridos no banco: ", </w:t>
+      </w:r>
+      <w:proofErr w:type="spellStart"/>
+      <w:r>
+        <w:t>valoresSensorTemperatura</w:t>
+      </w:r>
+      <w:proofErr w:type="spellEnd"/>
+      <w:r>
+        <w:t xml:space="preserve"> + ", " +</w:t>
+      </w:r>
+      <w:proofErr w:type="spellStart"/>
+      <w:r>
+        <w:t>valoresSensorUmidade</w:t>
+      </w:r>
+      <w:proofErr w:type="spellEnd"/>
+      <w:r>
+        <w:t xml:space="preserve"> );</w:t>
+      </w:r>
+    </w:p>
+    <w:p>
+      <w:r>
+        <w:t xml:space="preserve">            // este </w:t>
+      </w:r>
+      <w:proofErr w:type="spellStart"/>
+      <w:r>
+        <w:t>insert</w:t>
+      </w:r>
+      <w:proofErr w:type="spellEnd"/>
+      <w:r>
+        <w:t xml:space="preserve"> irá inserir os dados na tabela "medida"</w:t>
+      </w:r>
+    </w:p>
+    <w:p>
+      <w:r>
+        <w:t xml:space="preserve">            </w:t>
+      </w:r>
+      <w:proofErr w:type="spellStart"/>
+      <w:r>
+        <w:t>await</w:t>
+      </w:r>
+      <w:proofErr w:type="spellEnd"/>
+      <w:r>
+        <w:t xml:space="preserve"> </w:t>
+      </w:r>
+      <w:proofErr w:type="spellStart"/>
+      <w:r>
+        <w:t>poolBancoDados.execute</w:t>
+      </w:r>
+      <w:proofErr w:type="spellEnd"/>
+      <w:r>
         <w:t>(</w:t>
       </w:r>
-      <w:proofErr w:type="gramStart"/>
-      <w:r>
-        <w:t>valores[</w:t>
-      </w:r>
-      <w:proofErr w:type="gramEnd"/>
-      <w:r>
-        <w:t>0]);</w:t>
+    </w:p>
+    <w:p>
+      <w:r>
+        <w:t xml:space="preserve">                //'SELECT * FROM </w:t>
+      </w:r>
+      <w:proofErr w:type="spellStart"/>
+      <w:r>
+        <w:t>Historico</w:t>
+      </w:r>
+      <w:proofErr w:type="spellEnd"/>
+      <w:r>
+        <w:t>;'</w:t>
+      </w:r>
+    </w:p>
+    <w:p>
+      <w:r>
+        <w:t xml:space="preserve">                // 'INSERT INTO </w:t>
+      </w:r>
+      <w:proofErr w:type="spellStart"/>
+      <w:r>
+        <w:t>Historico</w:t>
+      </w:r>
+      <w:proofErr w:type="spellEnd"/>
+      <w:r>
+        <w:t>(</w:t>
+      </w:r>
+      <w:proofErr w:type="spellStart"/>
+      <w:r>
+        <w:t>valorUmidade</w:t>
+      </w:r>
+      <w:proofErr w:type="spellEnd"/>
+      <w:r>
+        <w:t>) VALUES (?);',</w:t>
+      </w:r>
+    </w:p>
+    <w:p>
+      <w:r>
+        <w:t>                // [sensorDHT11],</w:t>
+      </w:r>
+    </w:p>
+    <w:p>
+      <w:r>
+        <w:t xml:space="preserve">                // 'INSERT INTO </w:t>
+      </w:r>
+      <w:proofErr w:type="spellStart"/>
+      <w:r>
+        <w:t>Historico</w:t>
+      </w:r>
+      <w:proofErr w:type="spellEnd"/>
+      <w:r>
+        <w:t>(</w:t>
+      </w:r>
+      <w:proofErr w:type="spellStart"/>
+      <w:r>
+        <w:t>valorTemperatura</w:t>
+      </w:r>
+      <w:proofErr w:type="spellEnd"/>
+      <w:r>
+        <w:t>) VALUES (?);',</w:t>
+      </w:r>
+    </w:p>
+    <w:p>
+      <w:r>
+        <w:t>                // [sensorLM35]</w:t>
+      </w:r>
+    </w:p>
+    <w:p>
+      <w:r>
+        <w:t xml:space="preserve">                //'INSERT INTO </w:t>
+      </w:r>
+      <w:proofErr w:type="spellStart"/>
+      <w:r>
+        <w:t>Historico</w:t>
+      </w:r>
+      <w:proofErr w:type="spellEnd"/>
+      <w:r>
+        <w:t xml:space="preserve"> (data, </w:t>
+      </w:r>
+      <w:proofErr w:type="spellStart"/>
+      <w:r>
+        <w:t>valorUmidade</w:t>
+      </w:r>
+      <w:proofErr w:type="spellEnd"/>
+      <w:r>
+        <w:t xml:space="preserve">, </w:t>
+      </w:r>
+      <w:proofErr w:type="spellStart"/>
+      <w:r>
+        <w:t>valorTemperatura</w:t>
+      </w:r>
+      <w:proofErr w:type="spellEnd"/>
+      <w:r>
+        <w:t>) VALUES (2025-04-08, '+</w:t>
+      </w:r>
+      <w:proofErr w:type="spellStart"/>
+      <w:r>
+        <w:t>valoresSensorUmidade</w:t>
+      </w:r>
+      <w:proofErr w:type="spellEnd"/>
+      <w:r>
+        <w:t>+','+</w:t>
+      </w:r>
+      <w:proofErr w:type="spellStart"/>
+      <w:r>
+        <w:t>valoresSensorTemperatura</w:t>
+      </w:r>
+      <w:proofErr w:type="spellEnd"/>
+      <w:r>
+        <w:t>+');',</w:t>
+      </w:r>
+    </w:p>
+    <w:p>
+      <w:r>
+        <w:t xml:space="preserve">                'INSERT INTO </w:t>
+      </w:r>
+      <w:proofErr w:type="spellStart"/>
+      <w:r>
+        <w:t>Historico</w:t>
+      </w:r>
+      <w:proofErr w:type="spellEnd"/>
+      <w:r>
+        <w:t xml:space="preserve"> (</w:t>
+      </w:r>
+      <w:proofErr w:type="spellStart"/>
+      <w:r>
+        <w:t>valorUmidade</w:t>
+      </w:r>
+      <w:proofErr w:type="spellEnd"/>
+      <w:r>
+        <w:t xml:space="preserve">, </w:t>
+      </w:r>
+      <w:proofErr w:type="spellStart"/>
+      <w:r>
+        <w:t>valorTemperatura</w:t>
+      </w:r>
+      <w:proofErr w:type="spellEnd"/>
+      <w:r>
+        <w:t>) VALUES (?,?);',</w:t>
+      </w:r>
+    </w:p>
+    <w:p>
+      <w:r>
+        <w:t>                 [sensorDHT11, sensorLM35]</w:t>
+      </w:r>
+    </w:p>
+    <w:p>
+      <w:r>
+        <w:t>            );</w:t>
       </w:r>
     </w:p>
     <w:p>
       <w:r>
         <w:t xml:space="preserve">        </w:t>
       </w:r>
-      <w:proofErr w:type="spellStart"/>
+    </w:p>
+    <w:p/>
+    <w:p>
+      <w:r>
+        <w:t>        }</w:t>
+      </w:r>
+    </w:p>
+    <w:p/>
+    <w:p>
+      <w:r>
+        <w:t>    });</w:t>
+      </w:r>
+    </w:p>
+    <w:p/>
+    <w:p>
+      <w:r>
+        <w:t>    // evento para lidar com erros na comunicação serial</w:t>
+      </w:r>
+    </w:p>
+    <w:p>
+      <w:r>
+        <w:t xml:space="preserve">    </w:t>
+      </w:r>
+      <w:proofErr w:type="spellStart"/>
+      <w:r>
+        <w:t>arduino.on</w:t>
+      </w:r>
+      <w:proofErr w:type="spellEnd"/>
+      <w:r>
+        <w:t>('</w:t>
+      </w:r>
+      <w:proofErr w:type="spellStart"/>
+      <w:r>
+        <w:t>error</w:t>
+      </w:r>
+      <w:proofErr w:type="spellEnd"/>
+      <w:r>
+        <w:t>', (</w:t>
+      </w:r>
       <w:r>
         <w:rPr>
           <w:i/>
           <w:iCs/>
         </w:rPr>
+        <w:t>mensagem</w:t>
+      </w:r>
+      <w:r>
+        <w:t xml:space="preserve">) </w:t>
+      </w:r>
+      <w:r>
+        <w:rPr>
+          <w:i/>
+          <w:iCs/>
+        </w:rPr>
+        <w:t>=&gt;</w:t>
+      </w:r>
+      <w:r>
+        <w:t xml:space="preserve"> {</w:t>
+      </w:r>
+    </w:p>
+    <w:p>
+      <w:r>
+        <w:t xml:space="preserve">        </w:t>
+      </w:r>
+      <w:proofErr w:type="spellStart"/>
+      <w:r>
+        <w:t>console.error</w:t>
+      </w:r>
+      <w:proofErr w:type="spellEnd"/>
+      <w:r>
+        <w:t xml:space="preserve">(`Erro no </w:t>
+      </w:r>
+      <w:proofErr w:type="spellStart"/>
+      <w:r>
+        <w:t>arduino</w:t>
+      </w:r>
+      <w:proofErr w:type="spellEnd"/>
+      <w:r>
+        <w:t xml:space="preserve"> (Mensagem: ${mensagem} ---------------------------`)</w:t>
+      </w:r>
+    </w:p>
+    <w:p>
+      <w:r>
+        <w:t>    });</w:t>
+      </w:r>
+    </w:p>
+    <w:p>
+      <w:r>
+        <w:t>}</w:t>
+      </w:r>
+    </w:p>
+    <w:p/>
+    <w:p>
+      <w:r>
+        <w:t>// função para criar e configurar o servidor web</w:t>
+      </w:r>
+    </w:p>
+    <w:p>
+      <w:proofErr w:type="spellStart"/>
+      <w:r>
+        <w:rPr>
+          <w:i/>
+          <w:iCs/>
+        </w:rPr>
         <w:t>const</w:t>
       </w:r>
       <w:proofErr w:type="spellEnd"/>
       <w:r>
-        <w:t xml:space="preserve"> sensorDHT11 = </w:t>
-      </w:r>
-      <w:proofErr w:type="spellStart"/>
-      <w:r>
-        <w:t>parseFloat</w:t>
+        <w:t xml:space="preserve"> servidor = (</w:t>
+      </w:r>
+    </w:p>
+    <w:p>
+      <w:r>
+        <w:t xml:space="preserve">    </w:t>
+      </w:r>
+      <w:proofErr w:type="spellStart"/>
+      <w:r>
+        <w:rPr>
+          <w:i/>
+          <w:iCs/>
+        </w:rPr>
+        <w:t>valoresSensorUmidade</w:t>
+      </w:r>
+      <w:proofErr w:type="spellEnd"/>
+      <w:r>
+        <w:t>,</w:t>
+      </w:r>
+    </w:p>
+    <w:p>
+      <w:r>
+        <w:t xml:space="preserve">    </w:t>
+      </w:r>
+      <w:proofErr w:type="spellStart"/>
+      <w:r>
+        <w:rPr>
+          <w:i/>
+          <w:iCs/>
+        </w:rPr>
+        <w:t>valoresSensorTemperatura</w:t>
+      </w:r>
+      <w:proofErr w:type="spellEnd"/>
+    </w:p>
+    <w:p>
+      <w:r>
+        <w:t xml:space="preserve">) </w:t>
+      </w:r>
+      <w:r>
+        <w:rPr>
+          <w:i/>
+          <w:iCs/>
+        </w:rPr>
+        <w:t>=&gt;</w:t>
+      </w:r>
+      <w:r>
+        <w:t xml:space="preserve"> {</w:t>
+      </w:r>
+    </w:p>
+    <w:p>
+      <w:r>
+        <w:t xml:space="preserve">    </w:t>
+      </w:r>
+      <w:proofErr w:type="spellStart"/>
+      <w:r>
+        <w:rPr>
+          <w:i/>
+          <w:iCs/>
+        </w:rPr>
+        <w:t>const</w:t>
+      </w:r>
+      <w:proofErr w:type="spellEnd"/>
+      <w:r>
+        <w:t xml:space="preserve"> app = </w:t>
+      </w:r>
+      <w:proofErr w:type="spellStart"/>
+      <w:r>
+        <w:t>express</w:t>
+      </w:r>
+      <w:proofErr w:type="spellEnd"/>
+      <w:r>
+        <w:t>();</w:t>
+      </w:r>
+    </w:p>
+    <w:p/>
+    <w:p>
+      <w:r>
+        <w:t>    // configurações de requisição e resposta</w:t>
+      </w:r>
+    </w:p>
+    <w:p>
+      <w:r>
+        <w:t xml:space="preserve">    </w:t>
+      </w:r>
+      <w:proofErr w:type="spellStart"/>
+      <w:r>
+        <w:t>app.use</w:t>
+      </w:r>
+      <w:proofErr w:type="spellEnd"/>
+      <w:r>
+        <w:t>((</w:t>
+      </w:r>
+      <w:proofErr w:type="spellStart"/>
+      <w:r>
+        <w:rPr>
+          <w:i/>
+          <w:iCs/>
+        </w:rPr>
+        <w:t>request</w:t>
+      </w:r>
+      <w:proofErr w:type="spellEnd"/>
+      <w:r>
+        <w:t xml:space="preserve">, </w:t>
+      </w:r>
+      <w:r>
+        <w:rPr>
+          <w:i/>
+          <w:iCs/>
+        </w:rPr>
+        <w:t>response</w:t>
+      </w:r>
+      <w:r>
+        <w:t xml:space="preserve">, </w:t>
+      </w:r>
+      <w:proofErr w:type="spellStart"/>
+      <w:r>
+        <w:rPr>
+          <w:i/>
+          <w:iCs/>
+        </w:rPr>
+        <w:t>next</w:t>
+      </w:r>
+      <w:proofErr w:type="spellEnd"/>
+      <w:r>
+        <w:t xml:space="preserve">) </w:t>
+      </w:r>
+      <w:r>
+        <w:rPr>
+          <w:i/>
+          <w:iCs/>
+        </w:rPr>
+        <w:t>=&gt;</w:t>
+      </w:r>
+      <w:r>
+        <w:t xml:space="preserve"> {</w:t>
+      </w:r>
+    </w:p>
+    <w:p>
+      <w:r>
+        <w:t xml:space="preserve">        </w:t>
+      </w:r>
+      <w:proofErr w:type="spellStart"/>
+      <w:r>
+        <w:t>response.header</w:t>
+      </w:r>
+      <w:proofErr w:type="spellEnd"/>
+      <w:r>
+        <w:t>('Access-</w:t>
+      </w:r>
+      <w:proofErr w:type="spellStart"/>
+      <w:r>
+        <w:t>Control</w:t>
+      </w:r>
+      <w:proofErr w:type="spellEnd"/>
+      <w:r>
+        <w:t>-</w:t>
+      </w:r>
+      <w:proofErr w:type="spellStart"/>
+      <w:r>
+        <w:t>Allow-Origin</w:t>
+      </w:r>
+      <w:proofErr w:type="spellEnd"/>
+      <w:r>
+        <w:t>', '*');</w:t>
+      </w:r>
+    </w:p>
+    <w:p>
+      <w:r>
+        <w:t xml:space="preserve">        </w:t>
+      </w:r>
+      <w:proofErr w:type="spellStart"/>
+      <w:r>
+        <w:t>response.header</w:t>
+      </w:r>
+      <w:proofErr w:type="spellEnd"/>
+      <w:r>
+        <w:t>('Access-</w:t>
+      </w:r>
+      <w:proofErr w:type="spellStart"/>
+      <w:r>
+        <w:t>Control</w:t>
+      </w:r>
+      <w:proofErr w:type="spellEnd"/>
+      <w:r>
+        <w:t>-</w:t>
+      </w:r>
+      <w:proofErr w:type="spellStart"/>
+      <w:r>
+        <w:t>Allow-Headers</w:t>
+      </w:r>
+      <w:proofErr w:type="spellEnd"/>
+      <w:r>
+        <w:t>', '</w:t>
+      </w:r>
+      <w:proofErr w:type="spellStart"/>
+      <w:r>
+        <w:t>Origin</w:t>
+      </w:r>
+      <w:proofErr w:type="spellEnd"/>
+      <w:r>
+        <w:t xml:space="preserve">, </w:t>
+      </w:r>
+      <w:proofErr w:type="spellStart"/>
+      <w:r>
+        <w:t>Content-Type</w:t>
+      </w:r>
+      <w:proofErr w:type="spellEnd"/>
+      <w:r>
+        <w:t xml:space="preserve">, </w:t>
+      </w:r>
+      <w:proofErr w:type="spellStart"/>
+      <w:r>
+        <w:t>Accept</w:t>
+      </w:r>
+      <w:proofErr w:type="spellEnd"/>
+      <w:r>
+        <w:t>');</w:t>
+      </w:r>
+    </w:p>
+    <w:p>
+      <w:r>
+        <w:t xml:space="preserve">        </w:t>
+      </w:r>
+      <w:proofErr w:type="spellStart"/>
+      <w:r>
+        <w:t>next</w:t>
+      </w:r>
+      <w:proofErr w:type="spellEnd"/>
+      <w:r>
+        <w:t>();</w:t>
+      </w:r>
+    </w:p>
+    <w:p>
+      <w:r>
+        <w:t>    });</w:t>
+      </w:r>
+    </w:p>
+    <w:p/>
+    <w:p>
+      <w:r>
+        <w:t>    // inicia o servidor na porta especificada</w:t>
+      </w:r>
+    </w:p>
+    <w:p>
+      <w:r>
+        <w:t xml:space="preserve">    </w:t>
+      </w:r>
+      <w:proofErr w:type="spellStart"/>
+      <w:r>
+        <w:t>app.listen</w:t>
+      </w:r>
+      <w:proofErr w:type="spellEnd"/>
+      <w:r>
+        <w:t xml:space="preserve">(SERVIDOR_PORTA, () </w:t>
+      </w:r>
+      <w:r>
+        <w:rPr>
+          <w:i/>
+          <w:iCs/>
+        </w:rPr>
+        <w:t>=&gt;</w:t>
+      </w:r>
+      <w:r>
+        <w:t xml:space="preserve"> {</w:t>
+      </w:r>
+    </w:p>
+    <w:p>
+      <w:r>
+        <w:t>        console.log(`API executada com sucesso na porta ${SERVIDOR_PORTA}`);</w:t>
+      </w:r>
+    </w:p>
+    <w:p>
+      <w:r>
+        <w:t>    });</w:t>
+      </w:r>
+    </w:p>
+    <w:p/>
+    <w:p>
+      <w:r>
+        <w:t xml:space="preserve">    // define os </w:t>
+      </w:r>
+      <w:proofErr w:type="spellStart"/>
+      <w:r>
+        <w:t>endpoints</w:t>
+      </w:r>
+      <w:proofErr w:type="spellEnd"/>
+      <w:r>
+        <w:t xml:space="preserve"> da API para cada tipo de sensor</w:t>
+      </w:r>
+    </w:p>
+    <w:p>
+      <w:r>
+        <w:t xml:space="preserve">    </w:t>
+      </w:r>
+      <w:proofErr w:type="spellStart"/>
+      <w:r>
+        <w:t>app.get</w:t>
+      </w:r>
+      <w:proofErr w:type="spellEnd"/>
+      <w:r>
+        <w:t>('/sensores/</w:t>
+      </w:r>
+      <w:proofErr w:type="spellStart"/>
+      <w:r>
+        <w:t>analogico</w:t>
+      </w:r>
+      <w:proofErr w:type="spellEnd"/>
+      <w:r>
+        <w:t>', (</w:t>
+      </w:r>
+      <w:r>
+        <w:rPr>
+          <w:i/>
+          <w:iCs/>
+        </w:rPr>
+        <w:t>_</w:t>
+      </w:r>
+      <w:r>
+        <w:t xml:space="preserve">, </w:t>
+      </w:r>
+      <w:r>
+        <w:rPr>
+          <w:i/>
+          <w:iCs/>
+        </w:rPr>
+        <w:t>response</w:t>
+      </w:r>
+      <w:r>
+        <w:t xml:space="preserve">) </w:t>
+      </w:r>
+      <w:r>
+        <w:rPr>
+          <w:i/>
+          <w:iCs/>
+        </w:rPr>
+        <w:t>=&gt;</w:t>
+      </w:r>
+      <w:r>
+        <w:t xml:space="preserve"> {</w:t>
+      </w:r>
+    </w:p>
+    <w:p>
+      <w:r>
+        <w:t xml:space="preserve">        </w:t>
+      </w:r>
+      <w:proofErr w:type="spellStart"/>
+      <w:r>
+        <w:t>return</w:t>
+      </w:r>
+      <w:proofErr w:type="spellEnd"/>
+      <w:r>
+        <w:t xml:space="preserve"> </w:t>
+      </w:r>
+      <w:proofErr w:type="spellStart"/>
+      <w:r>
+        <w:t>response.json</w:t>
       </w:r>
       <w:proofErr w:type="spellEnd"/>
       <w:r>
         <w:t>(</w:t>
       </w:r>
-      <w:proofErr w:type="gramStart"/>
-      <w:r>
-        <w:t>valores[</w:t>
-      </w:r>
-      <w:proofErr w:type="gramEnd"/>
-      <w:r>
-        <w:t>1]);</w:t>
+      <w:proofErr w:type="spellStart"/>
+      <w:r>
+        <w:t>valoresSensorUmidade</w:t>
+      </w:r>
+      <w:proofErr w:type="spellEnd"/>
+      <w:r>
+        <w:t>);</w:t>
+      </w:r>
+    </w:p>
+    <w:p>
+      <w:r>
+        <w:t>    });</w:t>
+      </w:r>
+    </w:p>
+    <w:p>
+      <w:r>
+        <w:t xml:space="preserve">    </w:t>
+      </w:r>
+      <w:proofErr w:type="spellStart"/>
+      <w:r>
+        <w:t>app.get</w:t>
+      </w:r>
+      <w:proofErr w:type="spellEnd"/>
+      <w:r>
+        <w:t>('/sensores/digital', (</w:t>
+      </w:r>
+      <w:r>
+        <w:rPr>
+          <w:i/>
+          <w:iCs/>
+        </w:rPr>
+        <w:t>_</w:t>
+      </w:r>
+      <w:r>
+        <w:t xml:space="preserve">, </w:t>
+      </w:r>
+      <w:r>
+        <w:rPr>
+          <w:i/>
+          <w:iCs/>
+        </w:rPr>
+        <w:t>response</w:t>
+      </w:r>
+      <w:r>
+        <w:t xml:space="preserve">) </w:t>
+      </w:r>
+      <w:r>
+        <w:rPr>
+          <w:i/>
+          <w:iCs/>
+        </w:rPr>
+        <w:t>=&gt;</w:t>
+      </w:r>
+      <w:r>
+        <w:t xml:space="preserve"> {</w:t>
+      </w:r>
+    </w:p>
+    <w:p>
+      <w:r>
+        <w:t xml:space="preserve">        </w:t>
+      </w:r>
+      <w:proofErr w:type="spellStart"/>
+      <w:r>
+        <w:t>return</w:t>
+      </w:r>
+      <w:proofErr w:type="spellEnd"/>
+      <w:r>
+        <w:t xml:space="preserve"> </w:t>
+      </w:r>
+      <w:proofErr w:type="spellStart"/>
+      <w:r>
+        <w:t>response.json</w:t>
+      </w:r>
+      <w:proofErr w:type="spellEnd"/>
+      <w:r>
+        <w:t>(</w:t>
+      </w:r>
+      <w:proofErr w:type="spellStart"/>
+      <w:r>
+        <w:t>valoresSensorTemperatura</w:t>
+      </w:r>
+      <w:proofErr w:type="spellEnd"/>
+      <w:r>
+        <w:t>);</w:t>
+      </w:r>
+    </w:p>
+    <w:p>
+      <w:r>
+        <w:t>    });</w:t>
+      </w:r>
+    </w:p>
+    <w:p>
+      <w:r>
+        <w:t>}</w:t>
       </w:r>
     </w:p>
     <w:p/>
     <w:p>
       <w:r>
-        <w:t xml:space="preserve">        // armazena os valores dos sensores nos </w:t>
+        <w:t>// função principal assíncrona para iniciar a comunicação serial e o servidor web</w:t>
+      </w:r>
+    </w:p>
+    <w:p>
+      <w:r>
+        <w:t>(</w:t>
+      </w:r>
+      <w:proofErr w:type="spellStart"/>
+      <w:r>
+        <w:t>async</w:t>
+      </w:r>
+      <w:proofErr w:type="spellEnd"/>
+      <w:r>
+        <w:t xml:space="preserve"> () </w:t>
+      </w:r>
+      <w:r>
+        <w:rPr>
+          <w:i/>
+          <w:iCs/>
+        </w:rPr>
+        <w:t>=&gt;</w:t>
+      </w:r>
+      <w:r>
+        <w:t xml:space="preserve"> {</w:t>
+      </w:r>
+    </w:p>
+    <w:p>
+      <w:r>
+        <w:t xml:space="preserve">    // </w:t>
       </w:r>
       <w:proofErr w:type="spellStart"/>
       <w:r>
@@ -4906,7 +5684,76 @@
       </w:r>
       <w:proofErr w:type="spellEnd"/>
       <w:r>
-        <w:t xml:space="preserve"> correspondentes</w:t>
+        <w:t xml:space="preserve"> para armazenar os valores dos sensores</w:t>
+      </w:r>
+    </w:p>
+    <w:p>
+      <w:r>
+        <w:t xml:space="preserve">    </w:t>
+      </w:r>
+      <w:proofErr w:type="spellStart"/>
+      <w:r>
+        <w:rPr>
+          <w:i/>
+          <w:iCs/>
+        </w:rPr>
+        <w:t>const</w:t>
+      </w:r>
+      <w:proofErr w:type="spellEnd"/>
+      <w:r>
+        <w:t xml:space="preserve"> </w:t>
+      </w:r>
+      <w:proofErr w:type="spellStart"/>
+      <w:r>
+        <w:t>valoresSensorUmidade</w:t>
+      </w:r>
+      <w:proofErr w:type="spellEnd"/>
+      <w:r>
+        <w:t xml:space="preserve"> = [];</w:t>
+      </w:r>
+    </w:p>
+    <w:p>
+      <w:r>
+        <w:t xml:space="preserve">    </w:t>
+      </w:r>
+      <w:proofErr w:type="spellStart"/>
+      <w:r>
+        <w:rPr>
+          <w:i/>
+          <w:iCs/>
+        </w:rPr>
+        <w:t>const</w:t>
+      </w:r>
+      <w:proofErr w:type="spellEnd"/>
+      <w:r>
+        <w:t xml:space="preserve"> </w:t>
+      </w:r>
+      <w:proofErr w:type="spellStart"/>
+      <w:r>
+        <w:t>valoresSensorTemperatura</w:t>
+      </w:r>
+      <w:proofErr w:type="spellEnd"/>
+      <w:r>
+        <w:t xml:space="preserve"> = [];</w:t>
+      </w:r>
+    </w:p>
+    <w:p/>
+    <w:p>
+      <w:r>
+        <w:t>    // inicia a comunicação serial</w:t>
+      </w:r>
+    </w:p>
+    <w:p>
+      <w:r>
+        <w:t xml:space="preserve">    </w:t>
+      </w:r>
+      <w:proofErr w:type="spellStart"/>
+      <w:r>
+        <w:t>await</w:t>
+      </w:r>
+      <w:proofErr w:type="spellEnd"/>
+      <w:r>
+        <w:t xml:space="preserve"> serial(</w:t>
       </w:r>
     </w:p>
     <w:p>
@@ -4915,11 +5762,11 @@
       </w:r>
       <w:proofErr w:type="spellStart"/>
       <w:r>
-        <w:t>valoresSensorUmidade.push</w:t>
-      </w:r>
-      <w:proofErr w:type="spellEnd"/>
-      <w:r>
-        <w:t>(sensorDHT11);</w:t>
+        <w:t>valoresSensorUmidade</w:t>
+      </w:r>
+      <w:proofErr w:type="spellEnd"/>
+      <w:r>
+        <w:t>,</w:t>
       </w:r>
     </w:p>
     <w:p>
@@ -4928,1040 +5775,25 @@
       </w:r>
       <w:proofErr w:type="spellStart"/>
       <w:r>
-        <w:t>valoresSensorTemperatura.push</w:t>
-      </w:r>
-      <w:proofErr w:type="spellEnd"/>
-      <w:r>
-        <w:t>(sensorLM35);</w:t>
+        <w:t>valoresSensorTemperatura</w:t>
+      </w:r>
+      <w:proofErr w:type="spellEnd"/>
+    </w:p>
+    <w:p>
+      <w:r>
+        <w:t>    );</w:t>
       </w:r>
     </w:p>
     <w:p/>
     <w:p>
       <w:r>
-        <w:t>        // insere os dados no banco de dados (se habilitado)</w:t>
-      </w:r>
-    </w:p>
-    <w:p>
-      <w:r>
-        <w:t xml:space="preserve">        </w:t>
-      </w:r>
-      <w:proofErr w:type="spellStart"/>
-      <w:r>
-        <w:t>if</w:t>
-      </w:r>
-      <w:proofErr w:type="spellEnd"/>
-      <w:r>
-        <w:t xml:space="preserve"> (HABILITAR_OPERACAO_INSERIR) {</w:t>
-      </w:r>
-    </w:p>
-    <w:p>
-      <w:r>
-        <w:t xml:space="preserve">            </w:t>
-      </w:r>
-      <w:proofErr w:type="gramStart"/>
-      <w:r>
-        <w:t>console.log(</w:t>
-      </w:r>
-      <w:proofErr w:type="gramEnd"/>
-      <w:r>
-        <w:t xml:space="preserve">"valores inseridos no banco: ", </w:t>
-      </w:r>
-      <w:proofErr w:type="spellStart"/>
-      <w:r>
-        <w:t>valoresSensorTemperatura</w:t>
-      </w:r>
-      <w:proofErr w:type="spellEnd"/>
-      <w:r>
-        <w:t xml:space="preserve"> + ", " +</w:t>
-      </w:r>
-      <w:proofErr w:type="spellStart"/>
-      <w:proofErr w:type="gramStart"/>
-      <w:r>
-        <w:t>valoresSensorUmidade</w:t>
-      </w:r>
-      <w:proofErr w:type="spellEnd"/>
-      <w:r>
-        <w:t xml:space="preserve"> )</w:t>
-      </w:r>
-      <w:proofErr w:type="gramEnd"/>
-      <w:r>
-        <w:t>;</w:t>
-      </w:r>
-    </w:p>
-    <w:p>
-      <w:r>
-        <w:t xml:space="preserve">            // este </w:t>
-      </w:r>
-      <w:proofErr w:type="spellStart"/>
-      <w:r>
-        <w:t>insert</w:t>
-      </w:r>
-      <w:proofErr w:type="spellEnd"/>
-      <w:r>
-        <w:t xml:space="preserve"> irá inserir os dados na tabela "medida"</w:t>
-      </w:r>
-    </w:p>
-    <w:p>
-      <w:r>
-        <w:t xml:space="preserve">            </w:t>
-      </w:r>
-      <w:proofErr w:type="spellStart"/>
-      <w:r>
-        <w:t>await</w:t>
-      </w:r>
-      <w:proofErr w:type="spellEnd"/>
-      <w:r>
-        <w:t xml:space="preserve"> </w:t>
-      </w:r>
-      <w:proofErr w:type="spellStart"/>
-      <w:r>
-        <w:t>poolBancoDados.execute</w:t>
-      </w:r>
-      <w:proofErr w:type="spellEnd"/>
-      <w:r>
-        <w:t>(</w:t>
-      </w:r>
-    </w:p>
-    <w:p>
-      <w:r>
-        <w:t xml:space="preserve">                //'SELECT * FROM </w:t>
-      </w:r>
-      <w:proofErr w:type="spellStart"/>
-      <w:r>
-        <w:t>Historico</w:t>
-      </w:r>
-      <w:proofErr w:type="spellEnd"/>
-      <w:r>
-        <w:t>;'</w:t>
-      </w:r>
-    </w:p>
-    <w:p>
-      <w:r>
-        <w:t xml:space="preserve">                // 'INSERT INTO </w:t>
-      </w:r>
-      <w:proofErr w:type="spellStart"/>
-      <w:r>
-        <w:t>Historico</w:t>
-      </w:r>
-      <w:proofErr w:type="spellEnd"/>
-      <w:r>
-        <w:t>(</w:t>
-      </w:r>
-      <w:proofErr w:type="spellStart"/>
-      <w:r>
-        <w:t>valorUmidade</w:t>
-      </w:r>
-      <w:proofErr w:type="spellEnd"/>
-      <w:r>
-        <w:t>) VALUES (?);',</w:t>
-      </w:r>
-    </w:p>
-    <w:p>
-      <w:r>
-        <w:t>                // [sensorDHT11],</w:t>
-      </w:r>
-    </w:p>
-    <w:p>
-      <w:r>
-        <w:t xml:space="preserve">                // 'INSERT INTO </w:t>
-      </w:r>
-      <w:proofErr w:type="spellStart"/>
-      <w:r>
-        <w:t>Historico</w:t>
-      </w:r>
-      <w:proofErr w:type="spellEnd"/>
-      <w:r>
-        <w:t>(</w:t>
-      </w:r>
-      <w:proofErr w:type="spellStart"/>
-      <w:r>
-        <w:t>valorTemperatura</w:t>
-      </w:r>
-      <w:proofErr w:type="spellEnd"/>
-      <w:r>
-        <w:t>) VALUES (?);',</w:t>
-      </w:r>
-    </w:p>
-    <w:p>
-      <w:r>
-        <w:t>                // [sensorLM35]</w:t>
-      </w:r>
-    </w:p>
-    <w:p>
-      <w:r>
-        <w:t xml:space="preserve">                //'INSERT INTO </w:t>
-      </w:r>
-      <w:proofErr w:type="spellStart"/>
-      <w:r>
-        <w:t>Historico</w:t>
-      </w:r>
-      <w:proofErr w:type="spellEnd"/>
-      <w:r>
-        <w:t xml:space="preserve"> (data, </w:t>
-      </w:r>
-      <w:proofErr w:type="spellStart"/>
-      <w:r>
-        <w:t>valorUmidade</w:t>
-      </w:r>
-      <w:proofErr w:type="spellEnd"/>
-      <w:r>
-        <w:t xml:space="preserve">, </w:t>
-      </w:r>
-      <w:proofErr w:type="spellStart"/>
-      <w:r>
-        <w:t>valorTemperatura</w:t>
-      </w:r>
-      <w:proofErr w:type="spellEnd"/>
-      <w:r>
-        <w:t>) VALUES (2025-04-08, '+</w:t>
-      </w:r>
-      <w:proofErr w:type="spellStart"/>
-      <w:r>
-        <w:t>valoresSensorUmidade</w:t>
-      </w:r>
-      <w:proofErr w:type="spellEnd"/>
-      <w:r>
-        <w:t>+','+</w:t>
-      </w:r>
-      <w:proofErr w:type="spellStart"/>
-      <w:r>
-        <w:t>valoresSensorTemperatura</w:t>
-      </w:r>
-      <w:proofErr w:type="spellEnd"/>
-      <w:r>
-        <w:t>+');',</w:t>
-      </w:r>
-    </w:p>
-    <w:p>
-      <w:r>
-        <w:t xml:space="preserve">                'INSERT INTO </w:t>
-      </w:r>
-      <w:proofErr w:type="spellStart"/>
-      <w:r>
-        <w:t>Historico</w:t>
-      </w:r>
-      <w:proofErr w:type="spellEnd"/>
-      <w:r>
-        <w:t xml:space="preserve"> (</w:t>
-      </w:r>
-      <w:proofErr w:type="spellStart"/>
-      <w:r>
-        <w:t>valorUmidade</w:t>
-      </w:r>
-      <w:proofErr w:type="spellEnd"/>
-      <w:r>
-        <w:t xml:space="preserve">, </w:t>
-      </w:r>
-      <w:proofErr w:type="spellStart"/>
-      <w:r>
-        <w:t>valorTemperatura</w:t>
-      </w:r>
-      <w:proofErr w:type="spellEnd"/>
-      <w:r>
-        <w:t xml:space="preserve">) VALUES </w:t>
-      </w:r>
-      <w:proofErr w:type="gramStart"/>
-      <w:r>
-        <w:t>(?,?</w:t>
-      </w:r>
-      <w:proofErr w:type="gramEnd"/>
-      <w:r>
-        <w:t>);',</w:t>
-      </w:r>
-    </w:p>
-    <w:p>
-      <w:r>
-        <w:t>                 [sensorDHT11, sensorLM35]</w:t>
-      </w:r>
-    </w:p>
-    <w:p>
-      <w:r>
-        <w:t>            );</w:t>
-      </w:r>
-    </w:p>
-    <w:p>
-      <w:r>
-        <w:t xml:space="preserve">        </w:t>
-      </w:r>
-    </w:p>
-    <w:p/>
-    <w:p>
-      <w:r>
-        <w:t>        }</w:t>
-      </w:r>
-    </w:p>
-    <w:p/>
-    <w:p>
-      <w:r>
-        <w:t>    });</w:t>
-      </w:r>
-    </w:p>
-    <w:p/>
-    <w:p>
-      <w:r>
-        <w:t>    // evento para lidar com erros na comunicação serial</w:t>
-      </w:r>
-    </w:p>
-    <w:p>
-      <w:r>
-        <w:t xml:space="preserve">    </w:t>
-      </w:r>
-      <w:proofErr w:type="spellStart"/>
-      <w:proofErr w:type="gramStart"/>
-      <w:r>
-        <w:t>arduino.on</w:t>
-      </w:r>
-      <w:proofErr w:type="spellEnd"/>
-      <w:proofErr w:type="gramEnd"/>
-      <w:r>
-        <w:t>('</w:t>
-      </w:r>
-      <w:proofErr w:type="spellStart"/>
-      <w:r>
-        <w:t>error</w:t>
-      </w:r>
-      <w:proofErr w:type="spellEnd"/>
-      <w:r>
-        <w:t>', (</w:t>
-      </w:r>
-      <w:r>
-        <w:rPr>
-          <w:i/>
-          <w:iCs/>
-        </w:rPr>
-        <w:t>mensagem</w:t>
-      </w:r>
-      <w:r>
-        <w:t xml:space="preserve">) </w:t>
-      </w:r>
-      <w:r>
-        <w:rPr>
-          <w:i/>
-          <w:iCs/>
-        </w:rPr>
-        <w:t>=&gt;</w:t>
-      </w:r>
-      <w:r>
-        <w:t xml:space="preserve"> {</w:t>
-      </w:r>
-    </w:p>
-    <w:p>
-      <w:r>
-        <w:t xml:space="preserve">        </w:t>
-      </w:r>
-      <w:proofErr w:type="spellStart"/>
-      <w:proofErr w:type="gramStart"/>
-      <w:r>
-        <w:t>console.error</w:t>
-      </w:r>
-      <w:proofErr w:type="spellEnd"/>
-      <w:proofErr w:type="gramEnd"/>
-      <w:r>
-        <w:t xml:space="preserve">(`Erro no </w:t>
-      </w:r>
-      <w:proofErr w:type="spellStart"/>
-      <w:r>
-        <w:t>arduino</w:t>
-      </w:r>
-      <w:proofErr w:type="spellEnd"/>
-      <w:r>
-        <w:t xml:space="preserve"> (Mensagem: ${mensagem} ---------------------------`)</w:t>
-      </w:r>
-    </w:p>
-    <w:p>
-      <w:r>
-        <w:t>    });</w:t>
-      </w:r>
-    </w:p>
-    <w:p>
-      <w:r>
-        <w:t>}</w:t>
-      </w:r>
-    </w:p>
-    <w:p/>
-    <w:p>
-      <w:r>
-        <w:t>// função para criar e configurar o servidor web</w:t>
-      </w:r>
-    </w:p>
-    <w:p>
-      <w:proofErr w:type="spellStart"/>
-      <w:r>
-        <w:rPr>
-          <w:i/>
-          <w:iCs/>
-        </w:rPr>
-        <w:t>const</w:t>
-      </w:r>
-      <w:proofErr w:type="spellEnd"/>
-      <w:r>
-        <w:t xml:space="preserve"> servidor = (</w:t>
-      </w:r>
-    </w:p>
-    <w:p>
-      <w:r>
-        <w:t xml:space="preserve">    </w:t>
-      </w:r>
-      <w:proofErr w:type="spellStart"/>
-      <w:r>
-        <w:rPr>
-          <w:i/>
-          <w:iCs/>
-        </w:rPr>
-        <w:t>valoresSensorUmidade</w:t>
-      </w:r>
-      <w:proofErr w:type="spellEnd"/>
-      <w:r>
-        <w:t>,</w:t>
-      </w:r>
-    </w:p>
-    <w:p>
-      <w:r>
-        <w:t xml:space="preserve">    </w:t>
-      </w:r>
-      <w:proofErr w:type="spellStart"/>
-      <w:r>
-        <w:rPr>
-          <w:i/>
-          <w:iCs/>
-        </w:rPr>
-        <w:t>valoresSensorTemperatura</w:t>
-      </w:r>
-      <w:proofErr w:type="spellEnd"/>
-    </w:p>
-    <w:p>
-      <w:r>
-        <w:t xml:space="preserve">) </w:t>
-      </w:r>
-      <w:r>
-        <w:rPr>
-          <w:i/>
-          <w:iCs/>
-        </w:rPr>
-        <w:t>=&gt;</w:t>
-      </w:r>
-      <w:r>
-        <w:t xml:space="preserve"> {</w:t>
-      </w:r>
-    </w:p>
-    <w:p>
-      <w:r>
-        <w:t xml:space="preserve">    </w:t>
-      </w:r>
-      <w:proofErr w:type="spellStart"/>
-      <w:r>
-        <w:rPr>
-          <w:i/>
-          <w:iCs/>
-        </w:rPr>
-        <w:t>const</w:t>
-      </w:r>
-      <w:proofErr w:type="spellEnd"/>
-      <w:r>
-        <w:t xml:space="preserve"> app = </w:t>
-      </w:r>
-      <w:proofErr w:type="spellStart"/>
-      <w:proofErr w:type="gramStart"/>
-      <w:r>
-        <w:t>express</w:t>
-      </w:r>
-      <w:proofErr w:type="spellEnd"/>
-      <w:r>
-        <w:t>(</w:t>
-      </w:r>
-      <w:proofErr w:type="gramEnd"/>
-      <w:r>
-        <w:t>);</w:t>
-      </w:r>
-    </w:p>
-    <w:p/>
-    <w:p>
-      <w:r>
-        <w:t>    // configurações de requisição e resposta</w:t>
-      </w:r>
-    </w:p>
-    <w:p>
-      <w:r>
-        <w:t xml:space="preserve">    </w:t>
-      </w:r>
-      <w:proofErr w:type="spellStart"/>
-      <w:proofErr w:type="gramStart"/>
-      <w:r>
-        <w:t>app.use</w:t>
-      </w:r>
-      <w:proofErr w:type="spellEnd"/>
-      <w:r>
-        <w:t>(</w:t>
-      </w:r>
-      <w:proofErr w:type="gramEnd"/>
-      <w:r>
-        <w:t>(</w:t>
-      </w:r>
-      <w:proofErr w:type="spellStart"/>
-      <w:r>
-        <w:rPr>
-          <w:i/>
-          <w:iCs/>
-        </w:rPr>
-        <w:t>request</w:t>
-      </w:r>
-      <w:proofErr w:type="spellEnd"/>
-      <w:r>
-        <w:t xml:space="preserve">, </w:t>
-      </w:r>
-      <w:r>
-        <w:rPr>
-          <w:i/>
-          <w:iCs/>
-        </w:rPr>
-        <w:t>response</w:t>
-      </w:r>
-      <w:r>
-        <w:t xml:space="preserve">, </w:t>
-      </w:r>
-      <w:proofErr w:type="spellStart"/>
-      <w:r>
-        <w:rPr>
-          <w:i/>
-          <w:iCs/>
-        </w:rPr>
-        <w:t>next</w:t>
-      </w:r>
-      <w:proofErr w:type="spellEnd"/>
-      <w:r>
-        <w:t xml:space="preserve">) </w:t>
-      </w:r>
-      <w:r>
-        <w:rPr>
-          <w:i/>
-          <w:iCs/>
-        </w:rPr>
-        <w:t>=&gt;</w:t>
-      </w:r>
-      <w:r>
-        <w:t xml:space="preserve"> {</w:t>
-      </w:r>
-    </w:p>
-    <w:p>
-      <w:r>
-        <w:t xml:space="preserve">        </w:t>
-      </w:r>
-      <w:proofErr w:type="spellStart"/>
-      <w:proofErr w:type="gramStart"/>
-      <w:r>
-        <w:t>response.header</w:t>
-      </w:r>
-      <w:proofErr w:type="spellEnd"/>
-      <w:proofErr w:type="gramEnd"/>
-      <w:r>
-        <w:t>('Access-</w:t>
-      </w:r>
-      <w:proofErr w:type="spellStart"/>
-      <w:r>
-        <w:t>Control</w:t>
-      </w:r>
-      <w:proofErr w:type="spellEnd"/>
-      <w:r>
-        <w:t>-</w:t>
-      </w:r>
-      <w:proofErr w:type="spellStart"/>
-      <w:r>
-        <w:t>Allow-Origin</w:t>
-      </w:r>
-      <w:proofErr w:type="spellEnd"/>
-      <w:r>
-        <w:t>', '*');</w:t>
-      </w:r>
-    </w:p>
-    <w:p>
-      <w:r>
-        <w:t xml:space="preserve">        </w:t>
-      </w:r>
-      <w:proofErr w:type="spellStart"/>
-      <w:proofErr w:type="gramStart"/>
-      <w:r>
-        <w:t>response.header</w:t>
-      </w:r>
-      <w:proofErr w:type="spellEnd"/>
-      <w:proofErr w:type="gramEnd"/>
-      <w:r>
-        <w:t>('Access-</w:t>
-      </w:r>
-      <w:proofErr w:type="spellStart"/>
-      <w:r>
-        <w:t>Control</w:t>
-      </w:r>
-      <w:proofErr w:type="spellEnd"/>
-      <w:r>
-        <w:t>-</w:t>
-      </w:r>
-      <w:proofErr w:type="spellStart"/>
-      <w:r>
-        <w:t>Allow-Headers</w:t>
-      </w:r>
-      <w:proofErr w:type="spellEnd"/>
-      <w:r>
-        <w:t>', '</w:t>
-      </w:r>
-      <w:proofErr w:type="spellStart"/>
-      <w:r>
-        <w:t>Origin</w:t>
-      </w:r>
-      <w:proofErr w:type="spellEnd"/>
-      <w:r>
-        <w:t xml:space="preserve">, </w:t>
-      </w:r>
-      <w:proofErr w:type="spellStart"/>
-      <w:r>
-        <w:t>Content-Type</w:t>
-      </w:r>
-      <w:proofErr w:type="spellEnd"/>
-      <w:r>
-        <w:t xml:space="preserve">, </w:t>
-      </w:r>
-      <w:proofErr w:type="spellStart"/>
-      <w:r>
-        <w:t>Accept</w:t>
-      </w:r>
-      <w:proofErr w:type="spellEnd"/>
-      <w:r>
-        <w:t>');</w:t>
-      </w:r>
-    </w:p>
-    <w:p>
-      <w:r>
-        <w:t xml:space="preserve">        </w:t>
-      </w:r>
-      <w:proofErr w:type="spellStart"/>
-      <w:proofErr w:type="gramStart"/>
-      <w:r>
-        <w:t>next</w:t>
-      </w:r>
-      <w:proofErr w:type="spellEnd"/>
-      <w:r>
-        <w:t>(</w:t>
-      </w:r>
-      <w:proofErr w:type="gramEnd"/>
-      <w:r>
-        <w:t>);</w:t>
-      </w:r>
-    </w:p>
-    <w:p>
-      <w:r>
-        <w:t>    });</w:t>
-      </w:r>
-    </w:p>
-    <w:p/>
-    <w:p>
-      <w:r>
-        <w:t>    // inicia o servidor na porta especificada</w:t>
-      </w:r>
-    </w:p>
-    <w:p>
-      <w:r>
-        <w:t xml:space="preserve">    </w:t>
-      </w:r>
-      <w:proofErr w:type="spellStart"/>
-      <w:proofErr w:type="gramStart"/>
-      <w:r>
-        <w:t>app.listen</w:t>
-      </w:r>
-      <w:proofErr w:type="spellEnd"/>
-      <w:proofErr w:type="gramEnd"/>
-      <w:r>
-        <w:t xml:space="preserve">(SERVIDOR_PORTA, () </w:t>
-      </w:r>
-      <w:r>
-        <w:rPr>
-          <w:i/>
-          <w:iCs/>
-        </w:rPr>
-        <w:t>=&gt;</w:t>
-      </w:r>
-      <w:r>
-        <w:t xml:space="preserve"> {</w:t>
-      </w:r>
-    </w:p>
-    <w:p>
-      <w:r>
-        <w:t xml:space="preserve">        </w:t>
-      </w:r>
-      <w:proofErr w:type="gramStart"/>
-      <w:r>
-        <w:t>console.log(</w:t>
-      </w:r>
-      <w:proofErr w:type="gramEnd"/>
-      <w:r>
-        <w:t>`API executada com sucesso na porta ${SERVIDOR_</w:t>
-      </w:r>
-      <w:proofErr w:type="gramStart"/>
-      <w:r>
-        <w:t>PORTA}`</w:t>
-      </w:r>
-      <w:proofErr w:type="gramEnd"/>
-      <w:r>
-        <w:t>);</w:t>
-      </w:r>
-    </w:p>
-    <w:p>
-      <w:r>
-        <w:t>    });</w:t>
-      </w:r>
-    </w:p>
-    <w:p/>
-    <w:p>
-      <w:r>
-        <w:t xml:space="preserve">    // define os </w:t>
-      </w:r>
-      <w:proofErr w:type="spellStart"/>
-      <w:r>
-        <w:t>endpoints</w:t>
-      </w:r>
-      <w:proofErr w:type="spellEnd"/>
-      <w:r>
-        <w:t xml:space="preserve"> da API para cada tipo de sensor</w:t>
-      </w:r>
-    </w:p>
-    <w:p>
-      <w:r>
-        <w:t xml:space="preserve">    </w:t>
-      </w:r>
-      <w:proofErr w:type="spellStart"/>
-      <w:proofErr w:type="gramStart"/>
-      <w:r>
-        <w:t>app.get</w:t>
-      </w:r>
-      <w:proofErr w:type="spellEnd"/>
-      <w:r>
-        <w:t>(</w:t>
-      </w:r>
-      <w:proofErr w:type="gramEnd"/>
-      <w:r>
-        <w:t>'/sensores/</w:t>
-      </w:r>
-      <w:proofErr w:type="spellStart"/>
-      <w:r>
-        <w:t>analogico</w:t>
-      </w:r>
-      <w:proofErr w:type="spellEnd"/>
-      <w:r>
-        <w:t>', (</w:t>
-      </w:r>
-      <w:r>
-        <w:rPr>
-          <w:i/>
-          <w:iCs/>
-        </w:rPr>
-        <w:t>_</w:t>
-      </w:r>
-      <w:r>
-        <w:t xml:space="preserve">, </w:t>
-      </w:r>
-      <w:r>
-        <w:rPr>
-          <w:i/>
-          <w:iCs/>
-        </w:rPr>
-        <w:t>response</w:t>
-      </w:r>
-      <w:r>
-        <w:t xml:space="preserve">) </w:t>
-      </w:r>
-      <w:r>
-        <w:rPr>
-          <w:i/>
-          <w:iCs/>
-        </w:rPr>
-        <w:t>=&gt;</w:t>
-      </w:r>
-      <w:r>
-        <w:t xml:space="preserve"> {</w:t>
-      </w:r>
-    </w:p>
-    <w:p>
-      <w:r>
-        <w:t xml:space="preserve">        </w:t>
-      </w:r>
-      <w:proofErr w:type="spellStart"/>
-      <w:r>
-        <w:t>return</w:t>
-      </w:r>
-      <w:proofErr w:type="spellEnd"/>
-      <w:r>
-        <w:t xml:space="preserve"> </w:t>
-      </w:r>
-      <w:proofErr w:type="spellStart"/>
-      <w:proofErr w:type="gramStart"/>
-      <w:r>
-        <w:t>response.json</w:t>
-      </w:r>
-      <w:proofErr w:type="spellEnd"/>
-      <w:proofErr w:type="gramEnd"/>
-      <w:r>
-        <w:t>(</w:t>
-      </w:r>
-      <w:proofErr w:type="spellStart"/>
-      <w:r>
-        <w:t>valoresSensorUmidade</w:t>
-      </w:r>
-      <w:proofErr w:type="spellEnd"/>
-      <w:r>
-        <w:t>);</w:t>
-      </w:r>
-    </w:p>
-    <w:p>
-      <w:r>
-        <w:t>    });</w:t>
-      </w:r>
-    </w:p>
-    <w:p>
-      <w:r>
-        <w:t xml:space="preserve">    </w:t>
-      </w:r>
-      <w:proofErr w:type="spellStart"/>
-      <w:proofErr w:type="gramStart"/>
-      <w:r>
-        <w:t>app.get</w:t>
-      </w:r>
-      <w:proofErr w:type="spellEnd"/>
-      <w:r>
-        <w:t>(</w:t>
-      </w:r>
-      <w:proofErr w:type="gramEnd"/>
-      <w:r>
-        <w:t>'/sensores/digital', (</w:t>
-      </w:r>
-      <w:r>
-        <w:rPr>
-          <w:i/>
-          <w:iCs/>
-        </w:rPr>
-        <w:t>_</w:t>
-      </w:r>
-      <w:r>
-        <w:t xml:space="preserve">, </w:t>
-      </w:r>
-      <w:r>
-        <w:rPr>
-          <w:i/>
-          <w:iCs/>
-        </w:rPr>
-        <w:t>response</w:t>
-      </w:r>
-      <w:r>
-        <w:t xml:space="preserve">) </w:t>
-      </w:r>
-      <w:r>
-        <w:rPr>
-          <w:i/>
-          <w:iCs/>
-        </w:rPr>
-        <w:t>=&gt;</w:t>
-      </w:r>
-      <w:r>
-        <w:t xml:space="preserve"> {</w:t>
-      </w:r>
-    </w:p>
-    <w:p>
-      <w:r>
-        <w:t xml:space="preserve">        </w:t>
-      </w:r>
-      <w:proofErr w:type="spellStart"/>
-      <w:r>
-        <w:t>return</w:t>
-      </w:r>
-      <w:proofErr w:type="spellEnd"/>
-      <w:r>
-        <w:t xml:space="preserve"> </w:t>
-      </w:r>
-      <w:proofErr w:type="spellStart"/>
-      <w:proofErr w:type="gramStart"/>
-      <w:r>
-        <w:t>response.json</w:t>
-      </w:r>
-      <w:proofErr w:type="spellEnd"/>
-      <w:proofErr w:type="gramEnd"/>
-      <w:r>
-        <w:t>(</w:t>
-      </w:r>
-      <w:proofErr w:type="spellStart"/>
-      <w:r>
-        <w:t>valoresSensorTemperatura</w:t>
-      </w:r>
-      <w:proofErr w:type="spellEnd"/>
-      <w:r>
-        <w:t>);</w:t>
-      </w:r>
-    </w:p>
-    <w:p>
-      <w:r>
-        <w:t>    });</w:t>
-      </w:r>
-    </w:p>
-    <w:p>
-      <w:r>
-        <w:t>}</w:t>
-      </w:r>
-    </w:p>
-    <w:p/>
-    <w:p>
-      <w:r>
-        <w:t>// função principal assíncrona para iniciar a comunicação serial e o servidor web</w:t>
-      </w:r>
-    </w:p>
-    <w:p>
-      <w:r>
-        <w:t>(</w:t>
-      </w:r>
-      <w:proofErr w:type="spellStart"/>
-      <w:r>
-        <w:t>async</w:t>
-      </w:r>
-      <w:proofErr w:type="spellEnd"/>
-      <w:r>
-        <w:t xml:space="preserve"> () </w:t>
-      </w:r>
-      <w:r>
-        <w:rPr>
-          <w:i/>
-          <w:iCs/>
-        </w:rPr>
-        <w:t>=&gt;</w:t>
-      </w:r>
-      <w:r>
-        <w:t xml:space="preserve"> {</w:t>
-      </w:r>
-    </w:p>
-    <w:p>
-      <w:r>
-        <w:t xml:space="preserve">    // </w:t>
-      </w:r>
-      <w:proofErr w:type="spellStart"/>
-      <w:r>
-        <w:t>arrays</w:t>
-      </w:r>
-      <w:proofErr w:type="spellEnd"/>
-      <w:r>
-        <w:t xml:space="preserve"> para armazenar os valores dos sensores</w:t>
-      </w:r>
-    </w:p>
-    <w:p>
-      <w:r>
-        <w:t xml:space="preserve">    </w:t>
-      </w:r>
-      <w:proofErr w:type="spellStart"/>
-      <w:r>
-        <w:rPr>
-          <w:i/>
-          <w:iCs/>
-        </w:rPr>
-        <w:t>const</w:t>
-      </w:r>
-      <w:proofErr w:type="spellEnd"/>
-      <w:r>
-        <w:t xml:space="preserve"> </w:t>
-      </w:r>
-      <w:proofErr w:type="spellStart"/>
-      <w:r>
-        <w:t>valoresSensorUmidade</w:t>
-      </w:r>
-      <w:proofErr w:type="spellEnd"/>
-      <w:r>
-        <w:t xml:space="preserve"> = [];</w:t>
-      </w:r>
-    </w:p>
-    <w:p>
-      <w:r>
-        <w:t xml:space="preserve">    </w:t>
-      </w:r>
-      <w:proofErr w:type="spellStart"/>
-      <w:r>
-        <w:rPr>
-          <w:i/>
-          <w:iCs/>
-        </w:rPr>
-        <w:t>const</w:t>
-      </w:r>
-      <w:proofErr w:type="spellEnd"/>
-      <w:r>
-        <w:t xml:space="preserve"> </w:t>
-      </w:r>
-      <w:proofErr w:type="spellStart"/>
-      <w:r>
-        <w:t>valoresSensorTemperatura</w:t>
-      </w:r>
-      <w:proofErr w:type="spellEnd"/>
-      <w:r>
-        <w:t xml:space="preserve"> = [];</w:t>
-      </w:r>
-    </w:p>
-    <w:p/>
-    <w:p>
-      <w:r>
-        <w:t>    // inicia a comunicação serial</w:t>
-      </w:r>
-    </w:p>
-    <w:p>
-      <w:r>
-        <w:t xml:space="preserve">    </w:t>
-      </w:r>
-      <w:proofErr w:type="spellStart"/>
-      <w:r>
-        <w:t>await</w:t>
-      </w:r>
-      <w:proofErr w:type="spellEnd"/>
-      <w:r>
-        <w:t xml:space="preserve"> </w:t>
-      </w:r>
-      <w:proofErr w:type="gramStart"/>
-      <w:r>
-        <w:t>serial(</w:t>
-      </w:r>
-      <w:proofErr w:type="gramEnd"/>
-    </w:p>
-    <w:p>
-      <w:r>
-        <w:t xml:space="preserve">        </w:t>
-      </w:r>
-      <w:proofErr w:type="spellStart"/>
-      <w:r>
-        <w:t>valoresSensorUmidade</w:t>
-      </w:r>
-      <w:proofErr w:type="spellEnd"/>
-      <w:r>
-        <w:t>,</w:t>
-      </w:r>
-    </w:p>
-    <w:p>
-      <w:r>
-        <w:t xml:space="preserve">        </w:t>
-      </w:r>
-      <w:proofErr w:type="spellStart"/>
-      <w:r>
-        <w:t>valoresSensorTemperatura</w:t>
-      </w:r>
-      <w:proofErr w:type="spellEnd"/>
-    </w:p>
-    <w:p>
-      <w:r>
-        <w:t>    );</w:t>
-      </w:r>
-    </w:p>
-    <w:p/>
-    <w:p>
-      <w:r>
         <w:t>    // inicia o servidor web</w:t>
       </w:r>
     </w:p>
     <w:p>
       <w:r>
-        <w:t xml:space="preserve">    </w:t>
-      </w:r>
-      <w:proofErr w:type="gramStart"/>
-      <w:r>
-        <w:t>servidor(</w:t>
-      </w:r>
-      <w:proofErr w:type="gramEnd"/>
+        <w:t>    servidor(</w:t>
+      </w:r>
     </w:p>
     <w:p>
       <w:r>
@@ -7376,6 +7208,7 @@
   <w:style w:type="character" w:default="1" w:styleId="Fontepargpadro">
     <w:name w:val="Default Paragraph Font"/>
     <w:uiPriority w:val="1"/>
+    <w:semiHidden/>
     <w:unhideWhenUsed/>
   </w:style>
   <w:style w:type="table" w:default="1" w:styleId="Tabelanormal">
@@ -8070,12 +7903,11 @@
 </file>
 
 <file path=customXml/item1.xml><?xml version="1.0" encoding="utf-8"?>
-<?mso-contentType ?>
-<FormTemplates xmlns="http://schemas.microsoft.com/sharepoint/v3/contenttype/forms">
-  <Display>DocumentLibraryForm</Display>
-  <Edit>DocumentLibraryForm</Edit>
-  <New>DocumentLibraryForm</New>
-</FormTemplates>
+<p:properties xmlns:p="http://schemas.microsoft.com/office/2006/metadata/properties" xmlns:xsi="http://www.w3.org/2001/XMLSchema-instance" xmlns:pc="http://schemas.microsoft.com/office/infopath/2007/PartnerControls">
+  <documentManagement>
+    <_activity xmlns="1dc861b8-2196-455d-b291-a999da8cffb6" xsi:nil="true"/>
+  </documentManagement>
+</p:properties>
 </file>
 
 <file path=customXml/item2.xml><?xml version="1.0" encoding="utf-8"?>
@@ -8235,17 +8067,20 @@
 </file>
 
 <file path=customXml/item3.xml><?xml version="1.0" encoding="utf-8"?>
-<p:properties xmlns:p="http://schemas.microsoft.com/office/2006/metadata/properties" xmlns:xsi="http://www.w3.org/2001/XMLSchema-instance" xmlns:pc="http://schemas.microsoft.com/office/infopath/2007/PartnerControls">
-  <documentManagement>
-    <_activity xmlns="1dc861b8-2196-455d-b291-a999da8cffb6" xsi:nil="true"/>
-  </documentManagement>
-</p:properties>
+<?mso-contentType ?>
+<FormTemplates xmlns="http://schemas.microsoft.com/sharepoint/v3/contenttype/forms">
+  <Display>DocumentLibraryForm</Display>
+  <Edit>DocumentLibraryForm</Edit>
+  <New>DocumentLibraryForm</New>
+</FormTemplates>
 </file>
 
 <file path=customXml/itemProps1.xml><?xml version="1.0" encoding="utf-8"?>
-<ds:datastoreItem xmlns:ds="http://schemas.openxmlformats.org/officeDocument/2006/customXml" ds:itemID="{2311FEA5-7273-4D90-92B9-F5189F3D710A}">
+<ds:datastoreItem xmlns:ds="http://schemas.openxmlformats.org/officeDocument/2006/customXml" ds:itemID="{9DAB58E4-4D3A-4AA7-B901-A5D4DBBD037C}">
   <ds:schemaRefs>
-    <ds:schemaRef ds:uri="http://schemas.microsoft.com/sharepoint/v3/contenttype/forms"/>
+    <ds:schemaRef ds:uri="http://schemas.microsoft.com/office/2006/metadata/properties"/>
+    <ds:schemaRef ds:uri="http://schemas.microsoft.com/office/infopath/2007/PartnerControls"/>
+    <ds:schemaRef ds:uri="1dc861b8-2196-455d-b291-a999da8cffb6"/>
   </ds:schemaRefs>
 </ds:datastoreItem>
 </file>
@@ -8269,17 +8104,9 @@
 </file>
 
 <file path=customXml/itemProps3.xml><?xml version="1.0" encoding="utf-8"?>
-<ds:datastoreItem xmlns:ds="http://schemas.openxmlformats.org/officeDocument/2006/customXml" ds:itemID="{9DAB58E4-4D3A-4AA7-B901-A5D4DBBD037C}">
+<ds:datastoreItem xmlns:ds="http://schemas.openxmlformats.org/officeDocument/2006/customXml" ds:itemID="{2311FEA5-7273-4D90-92B9-F5189F3D710A}">
   <ds:schemaRefs>
-    <ds:schemaRef ds:uri="http://purl.org/dc/terms/"/>
-    <ds:schemaRef ds:uri="http://purl.org/dc/elements/1.1/"/>
-    <ds:schemaRef ds:uri="http://purl.org/dc/dcmitype/"/>
-    <ds:schemaRef ds:uri="http://schemas.microsoft.com/office/infopath/2007/PartnerControls"/>
-    <ds:schemaRef ds:uri="http://schemas.microsoft.com/office/2006/documentManagement/types"/>
-    <ds:schemaRef ds:uri="http://schemas.openxmlformats.org/package/2006/metadata/core-properties"/>
-    <ds:schemaRef ds:uri="http://www.w3.org/XML/1998/namespace"/>
-    <ds:schemaRef ds:uri="http://schemas.microsoft.com/office/2006/metadata/properties"/>
-    <ds:schemaRef ds:uri="1dc861b8-2196-455d-b291-a999da8cffb6"/>
+    <ds:schemaRef ds:uri="http://schemas.microsoft.com/sharepoint/v3/contenttype/forms"/>
   </ds:schemaRefs>
 </ds:datastoreItem>
 </file>
</xml_diff>